<commit_message>
Cas d'utilisation - Itération 1
</commit_message>
<xml_diff>
--- a/res/cas_utilisation.docx
+++ b/res/cas_utilisation.docx
@@ -266,14 +266,7 @@
           <w:rFonts w:ascii="Times New Roman" w:hAnsi="Times New Roman" w:cs="Times New Roman"/>
           <w:lang w:val="fr-FR"/>
         </w:rPr>
-        <w:t>MARIN MEJIA, ER</w:t>
-      </w:r>
-      <w:r>
-        <w:rPr>
-          <w:rFonts w:ascii="Times New Roman" w:hAnsi="Times New Roman" w:cs="Times New Roman"/>
-          <w:lang w:val="fr-FR"/>
-        </w:rPr>
-        <w:t>IC</w:t>
+        <w:t>MARIN MEJIA, ERIC</w:t>
       </w:r>
     </w:p>
     <w:p>
@@ -289,42 +282,7 @@
           <w:rFonts w:ascii="Times New Roman" w:hAnsi="Times New Roman" w:cs="Times New Roman"/>
           <w:lang w:val="fr-FR"/>
         </w:rPr>
-        <w:t xml:space="preserve">MONTRÉAL, </w:t>
-      </w:r>
-      <w:r>
-        <w:rPr>
-          <w:rFonts w:ascii="Times New Roman" w:hAnsi="Times New Roman" w:cs="Times New Roman"/>
-          <w:lang w:val="fr-FR"/>
-        </w:rPr>
-        <w:t>22</w:t>
-      </w:r>
-      <w:r>
-        <w:rPr>
-          <w:rFonts w:ascii="Times New Roman" w:hAnsi="Times New Roman" w:cs="Times New Roman"/>
-          <w:lang w:val="fr-FR"/>
-        </w:rPr>
-        <w:t xml:space="preserve"> </w:t>
-      </w:r>
-      <w:r>
-        <w:rPr>
-          <w:rFonts w:ascii="Times New Roman" w:hAnsi="Times New Roman" w:cs="Times New Roman"/>
-          <w:lang w:val="fr-FR"/>
-        </w:rPr>
-        <w:t>OCTOBRE</w:t>
-      </w:r>
-      <w:r>
-        <w:rPr>
-          <w:rFonts w:ascii="Times New Roman" w:hAnsi="Times New Roman" w:cs="Times New Roman"/>
-          <w:lang w:val="fr-FR"/>
-        </w:rPr>
-        <w:t xml:space="preserve"> 202</w:t>
-      </w:r>
-      <w:r>
-        <w:rPr>
-          <w:rFonts w:ascii="Times New Roman" w:hAnsi="Times New Roman" w:cs="Times New Roman"/>
-          <w:lang w:val="fr-FR"/>
-        </w:rPr>
-        <w:t>6</w:t>
+        <w:t>MONTRÉAL, 22 OCTOBRE 2026</w:t>
       </w:r>
     </w:p>
     <w:p>
@@ -333,6 +291,8 @@
           <w:rFonts w:ascii="Times New Roman" w:hAnsi="Times New Roman" w:cs="Times New Roman"/>
           <w:b/>
           <w:bCs/>
+          <w:sz w:val="26"/>
+          <w:szCs w:val="26"/>
           <w:lang w:val="fr-FR"/>
         </w:rPr>
       </w:pPr>
@@ -341,6 +301,8 @@
           <w:rFonts w:ascii="Times New Roman" w:hAnsi="Times New Roman" w:cs="Times New Roman"/>
           <w:b/>
           <w:bCs/>
+          <w:sz w:val="26"/>
+          <w:szCs w:val="26"/>
           <w:lang w:val="fr-FR"/>
         </w:rPr>
         <w:lastRenderedPageBreak/>
@@ -351,6 +313,8 @@
           <w:rFonts w:ascii="Times New Roman" w:hAnsi="Times New Roman" w:cs="Times New Roman"/>
           <w:b/>
           <w:bCs/>
+          <w:sz w:val="26"/>
+          <w:szCs w:val="26"/>
           <w:lang w:val="fr-FR"/>
         </w:rPr>
         <w:t>les clés publiques et privées</w:t>
@@ -364,160 +328,45 @@
         </w:rPr>
       </w:pPr>
       <w:r>
-        <w:rPr>
-          <w:rFonts w:ascii="Times New Roman" w:hAnsi="Times New Roman" w:cs="Times New Roman"/>
-          <w:lang w:val="fr-FR"/>
-        </w:rPr>
-        <w:t xml:space="preserve">Acteur principal : </w:t>
-      </w:r>
-    </w:p>
-    <w:p>
-      <w:pPr>
-        <w:rPr>
-          <w:rFonts w:ascii="Times New Roman" w:hAnsi="Times New Roman" w:cs="Times New Roman"/>
-          <w:lang w:val="fr-FR"/>
-        </w:rPr>
-      </w:pPr>
-    </w:p>
-    <w:p>
-      <w:pPr>
-        <w:rPr>
-          <w:rFonts w:ascii="Times New Roman" w:hAnsi="Times New Roman" w:cs="Times New Roman"/>
-          <w:lang w:val="fr-FR"/>
-        </w:rPr>
-      </w:pPr>
-      <w:r>
-        <w:rPr>
-          <w:rFonts w:ascii="Times New Roman" w:hAnsi="Times New Roman" w:cs="Times New Roman"/>
-          <w:lang w:val="fr-FR"/>
-        </w:rPr>
-        <w:t xml:space="preserve">Préconditions : </w:t>
-      </w:r>
-    </w:p>
-    <w:p>
-      <w:pPr>
-        <w:rPr>
-          <w:rFonts w:ascii="Times New Roman" w:hAnsi="Times New Roman" w:cs="Times New Roman"/>
-          <w:lang w:val="fr-FR"/>
-        </w:rPr>
-      </w:pPr>
-    </w:p>
-    <w:p>
-      <w:pPr>
-        <w:rPr>
-          <w:rFonts w:ascii="Times New Roman" w:hAnsi="Times New Roman" w:cs="Times New Roman"/>
-          <w:lang w:val="fr-FR"/>
-        </w:rPr>
-      </w:pPr>
-      <w:r>
-        <w:rPr>
-          <w:rFonts w:ascii="Times New Roman" w:hAnsi="Times New Roman" w:cs="Times New Roman"/>
-          <w:lang w:val="fr-FR"/>
-        </w:rPr>
-        <w:t>Postconditions :</w:t>
-      </w:r>
-    </w:p>
-    <w:p>
-      <w:pPr>
-        <w:rPr>
-          <w:rFonts w:ascii="Times New Roman" w:hAnsi="Times New Roman" w:cs="Times New Roman"/>
-          <w:lang w:val="fr-FR"/>
-        </w:rPr>
-      </w:pPr>
-    </w:p>
-    <w:p>
-      <w:pPr>
-        <w:rPr>
-          <w:rFonts w:ascii="Times New Roman" w:hAnsi="Times New Roman" w:cs="Times New Roman"/>
-          <w:lang w:val="fr-FR"/>
-        </w:rPr>
-      </w:pPr>
-      <w:r>
-        <w:rPr>
-          <w:rFonts w:ascii="Times New Roman" w:hAnsi="Times New Roman" w:cs="Times New Roman"/>
-          <w:lang w:val="fr-FR"/>
-        </w:rPr>
-        <w:t xml:space="preserve">Scénario principal : </w:t>
-      </w:r>
-    </w:p>
-    <w:p>
-      <w:pPr>
-        <w:rPr>
-          <w:rFonts w:ascii="Times New Roman" w:hAnsi="Times New Roman" w:cs="Times New Roman"/>
-          <w:lang w:val="fr-FR"/>
-        </w:rPr>
-      </w:pPr>
-    </w:p>
-    <w:p>
-      <w:pPr>
-        <w:rPr>
-          <w:rFonts w:ascii="Times New Roman" w:hAnsi="Times New Roman" w:cs="Times New Roman"/>
-          <w:lang w:val="fr-FR"/>
-        </w:rPr>
-      </w:pPr>
-      <w:r>
-        <w:rPr>
-          <w:rFonts w:ascii="Times New Roman" w:hAnsi="Times New Roman" w:cs="Times New Roman"/>
-          <w:lang w:val="fr-FR"/>
-        </w:rPr>
-        <w:t>Scénarios alternatifs :</w:t>
-      </w:r>
-    </w:p>
-    <w:p>
-      <w:pPr>
-        <w:rPr>
-          <w:rFonts w:ascii="Times New Roman" w:hAnsi="Times New Roman" w:cs="Times New Roman"/>
-          <w:lang w:val="fr-FR"/>
-        </w:rPr>
-      </w:pPr>
-    </w:p>
-    <w:p>
-      <w:pPr>
-        <w:rPr>
-          <w:rFonts w:ascii="Times New Roman" w:hAnsi="Times New Roman" w:cs="Times New Roman"/>
-          <w:lang w:val="fr-FR"/>
-        </w:rPr>
-      </w:pPr>
-      <w:r>
-        <w:rPr>
-          <w:rFonts w:ascii="Times New Roman" w:hAnsi="Times New Roman" w:cs="Times New Roman"/>
-          <w:lang w:val="fr-FR"/>
-        </w:rPr>
-        <w:t>Tests supplémentaires :</w:t>
-      </w:r>
-    </w:p>
-    <w:p>
-      <w:pPr>
-        <w:rPr>
-          <w:lang w:val="fr-FR"/>
-        </w:rPr>
-      </w:pPr>
-    </w:p>
-    <w:p>
-      <w:pPr>
-        <w:rPr>
-          <w:lang w:val="fr-FR"/>
-        </w:rPr>
-      </w:pPr>
-    </w:p>
-    <w:p>
-      <w:pPr>
         <w:rPr>
           <w:rFonts w:ascii="Times New Roman" w:hAnsi="Times New Roman" w:cs="Times New Roman"/>
           <w:b/>
           <w:bCs/>
           <w:lang w:val="fr-FR"/>
         </w:rPr>
-      </w:pPr>
-      <w:r>
+        <w:t>Acteur principal :</w:t>
+      </w:r>
+      <w:r>
+        <w:rPr>
+          <w:rFonts w:ascii="Times New Roman" w:hAnsi="Times New Roman" w:cs="Times New Roman"/>
+          <w:lang w:val="fr-FR"/>
+        </w:rPr>
+        <w:t xml:space="preserve"> </w:t>
+      </w:r>
+      <w:r>
+        <w:rPr>
+          <w:rFonts w:ascii="Times New Roman" w:hAnsi="Times New Roman" w:cs="Times New Roman"/>
+          <w:lang w:val="fr-FR"/>
+        </w:rPr>
+        <w:t>Utilisateur récipient</w:t>
+      </w:r>
+      <w:r>
+        <w:rPr>
+          <w:rFonts w:ascii="Times New Roman" w:hAnsi="Times New Roman" w:cs="Times New Roman"/>
+          <w:lang w:val="fr-FR"/>
+        </w:rPr>
+        <w:t>.</w:t>
+      </w:r>
+    </w:p>
+    <w:p>
+      <w:pPr>
         <w:rPr>
           <w:rFonts w:ascii="Times New Roman" w:hAnsi="Times New Roman" w:cs="Times New Roman"/>
           <w:b/>
           <w:bCs/>
           <w:lang w:val="fr-FR"/>
         </w:rPr>
-        <w:t>CU0</w:t>
-      </w:r>
+      </w:pPr>
       <w:r>
         <w:rPr>
           <w:rFonts w:ascii="Times New Roman" w:hAnsi="Times New Roman" w:cs="Times New Roman"/>
@@ -525,17 +374,45 @@
           <w:bCs/>
           <w:lang w:val="fr-FR"/>
         </w:rPr>
-        <w:t>2</w:t>
-      </w:r>
-      <w:r>
+        <w:t xml:space="preserve">Préconditions : </w:t>
+      </w:r>
+    </w:p>
+    <w:p>
+      <w:pPr>
+        <w:pStyle w:val="Paragraphedeliste"/>
+        <w:numPr>
+          <w:ilvl w:val="0"/>
+          <w:numId w:val="1"/>
+        </w:numPr>
+        <w:rPr>
+          <w:rFonts w:ascii="Times New Roman" w:hAnsi="Times New Roman" w:cs="Times New Roman"/>
+          <w:lang w:val="fr-FR"/>
+        </w:rPr>
+      </w:pPr>
+      <w:r>
+        <w:rPr>
+          <w:rFonts w:ascii="Times New Roman" w:hAnsi="Times New Roman" w:cs="Times New Roman"/>
+          <w:lang w:val="fr-FR"/>
+        </w:rPr>
+        <w:t>Aucune précondition</w:t>
+      </w:r>
+      <w:r>
+        <w:rPr>
+          <w:rFonts w:ascii="Times New Roman" w:hAnsi="Times New Roman" w:cs="Times New Roman"/>
+          <w:lang w:val="fr-FR"/>
+        </w:rPr>
+        <w:t>.</w:t>
+      </w:r>
+    </w:p>
+    <w:p>
+      <w:pPr>
         <w:rPr>
           <w:rFonts w:ascii="Times New Roman" w:hAnsi="Times New Roman" w:cs="Times New Roman"/>
           <w:b/>
           <w:bCs/>
           <w:lang w:val="fr-FR"/>
         </w:rPr>
-        <w:t xml:space="preserve"> </w:t>
-      </w:r>
+      </w:pPr>
       <w:r>
         <w:rPr>
           <w:rFonts w:ascii="Times New Roman" w:hAnsi="Times New Roman" w:cs="Times New Roman"/>
@@ -543,145 +420,63 @@
           <w:bCs/>
           <w:lang w:val="fr-FR"/>
         </w:rPr>
-        <w:t>Encrypter à l’aide de la clé publique</w:t>
-      </w:r>
-    </w:p>
-    <w:p>
-      <w:pPr>
-        <w:rPr>
-          <w:rFonts w:ascii="Times New Roman" w:hAnsi="Times New Roman" w:cs="Times New Roman"/>
-          <w:lang w:val="fr-FR"/>
-        </w:rPr>
-      </w:pPr>
-      <w:r>
-        <w:rPr>
-          <w:rFonts w:ascii="Times New Roman" w:hAnsi="Times New Roman" w:cs="Times New Roman"/>
-          <w:lang w:val="fr-FR"/>
-        </w:rPr>
-        <w:t xml:space="preserve">Acteur principal : </w:t>
-      </w:r>
-    </w:p>
-    <w:p>
-      <w:pPr>
-        <w:rPr>
-          <w:rFonts w:ascii="Times New Roman" w:hAnsi="Times New Roman" w:cs="Times New Roman"/>
-          <w:lang w:val="fr-FR"/>
-        </w:rPr>
-      </w:pPr>
-    </w:p>
-    <w:p>
-      <w:pPr>
-        <w:rPr>
-          <w:rFonts w:ascii="Times New Roman" w:hAnsi="Times New Roman" w:cs="Times New Roman"/>
-          <w:lang w:val="fr-FR"/>
-        </w:rPr>
-      </w:pPr>
-      <w:r>
-        <w:rPr>
-          <w:rFonts w:ascii="Times New Roman" w:hAnsi="Times New Roman" w:cs="Times New Roman"/>
-          <w:lang w:val="fr-FR"/>
-        </w:rPr>
-        <w:t xml:space="preserve">Préconditions : </w:t>
-      </w:r>
-    </w:p>
-    <w:p>
-      <w:pPr>
-        <w:rPr>
-          <w:rFonts w:ascii="Times New Roman" w:hAnsi="Times New Roman" w:cs="Times New Roman"/>
-          <w:lang w:val="fr-FR"/>
-        </w:rPr>
-      </w:pPr>
-    </w:p>
-    <w:p>
-      <w:pPr>
-        <w:rPr>
-          <w:rFonts w:ascii="Times New Roman" w:hAnsi="Times New Roman" w:cs="Times New Roman"/>
-          <w:lang w:val="fr-FR"/>
-        </w:rPr>
-      </w:pPr>
-      <w:r>
-        <w:rPr>
-          <w:rFonts w:ascii="Times New Roman" w:hAnsi="Times New Roman" w:cs="Times New Roman"/>
-          <w:lang w:val="fr-FR"/>
-        </w:rPr>
         <w:t>Postconditions :</w:t>
       </w:r>
     </w:p>
     <w:p>
       <w:pPr>
-        <w:rPr>
-          <w:rFonts w:ascii="Times New Roman" w:hAnsi="Times New Roman" w:cs="Times New Roman"/>
-          <w:lang w:val="fr-FR"/>
-        </w:rPr>
-      </w:pPr>
-    </w:p>
-    <w:p>
-      <w:pPr>
-        <w:rPr>
-          <w:rFonts w:ascii="Times New Roman" w:hAnsi="Times New Roman" w:cs="Times New Roman"/>
-          <w:lang w:val="fr-FR"/>
-        </w:rPr>
-      </w:pPr>
-      <w:r>
-        <w:rPr>
-          <w:rFonts w:ascii="Times New Roman" w:hAnsi="Times New Roman" w:cs="Times New Roman"/>
-          <w:lang w:val="fr-FR"/>
-        </w:rPr>
-        <w:t xml:space="preserve">Scénario principal : </w:t>
-      </w:r>
-    </w:p>
-    <w:p>
-      <w:pPr>
-        <w:rPr>
-          <w:rFonts w:ascii="Times New Roman" w:hAnsi="Times New Roman" w:cs="Times New Roman"/>
-          <w:lang w:val="fr-FR"/>
-        </w:rPr>
-      </w:pPr>
-    </w:p>
-    <w:p>
-      <w:pPr>
-        <w:rPr>
-          <w:rFonts w:ascii="Times New Roman" w:hAnsi="Times New Roman" w:cs="Times New Roman"/>
-          <w:lang w:val="fr-FR"/>
-        </w:rPr>
-      </w:pPr>
-      <w:r>
-        <w:rPr>
-          <w:rFonts w:ascii="Times New Roman" w:hAnsi="Times New Roman" w:cs="Times New Roman"/>
-          <w:lang w:val="fr-FR"/>
-        </w:rPr>
-        <w:t>Scénarios alternatifs :</w:t>
-      </w:r>
-    </w:p>
-    <w:p>
-      <w:pPr>
-        <w:rPr>
-          <w:rFonts w:ascii="Times New Roman" w:hAnsi="Times New Roman" w:cs="Times New Roman"/>
-          <w:lang w:val="fr-FR"/>
-        </w:rPr>
-      </w:pPr>
-    </w:p>
-    <w:p>
-      <w:pPr>
-        <w:rPr>
-          <w:rFonts w:ascii="Times New Roman" w:hAnsi="Times New Roman" w:cs="Times New Roman"/>
-          <w:lang w:val="fr-FR"/>
-        </w:rPr>
-      </w:pPr>
-      <w:r>
-        <w:rPr>
-          <w:rFonts w:ascii="Times New Roman" w:hAnsi="Times New Roman" w:cs="Times New Roman"/>
-          <w:lang w:val="fr-FR"/>
-        </w:rPr>
-        <w:t>Tests supplémentaires :</w:t>
-      </w:r>
-    </w:p>
-    <w:p>
-      <w:pPr>
-        <w:rPr>
-          <w:lang w:val="fr-FR"/>
-        </w:rPr>
-      </w:pPr>
+        <w:pStyle w:val="Paragraphedeliste"/>
+        <w:numPr>
+          <w:ilvl w:val="0"/>
+          <w:numId w:val="1"/>
+        </w:numPr>
+        <w:rPr>
+          <w:rFonts w:ascii="Times New Roman" w:hAnsi="Times New Roman" w:cs="Times New Roman"/>
+          <w:lang w:val="fr-FR"/>
+        </w:rPr>
+      </w:pPr>
+      <w:r>
+        <w:rPr>
+          <w:rFonts w:ascii="Times New Roman" w:hAnsi="Times New Roman" w:cs="Times New Roman"/>
+          <w:lang w:val="fr-FR"/>
+        </w:rPr>
+        <w:t>L</w:t>
+      </w:r>
+      <w:r>
+        <w:rPr>
+          <w:rFonts w:ascii="Times New Roman" w:hAnsi="Times New Roman" w:cs="Times New Roman"/>
+          <w:lang w:val="fr-FR"/>
+        </w:rPr>
+        <w:t>es</w:t>
+      </w:r>
+      <w:r>
+        <w:rPr>
+          <w:rFonts w:ascii="Times New Roman" w:hAnsi="Times New Roman" w:cs="Times New Roman"/>
+          <w:lang w:val="fr-FR"/>
+        </w:rPr>
+        <w:t xml:space="preserve"> clé</w:t>
+      </w:r>
+      <w:r>
+        <w:rPr>
+          <w:rFonts w:ascii="Times New Roman" w:hAnsi="Times New Roman" w:cs="Times New Roman"/>
+          <w:lang w:val="fr-FR"/>
+        </w:rPr>
+        <w:t>s</w:t>
+      </w:r>
+      <w:r>
+        <w:rPr>
+          <w:rFonts w:ascii="Times New Roman" w:hAnsi="Times New Roman" w:cs="Times New Roman"/>
+          <w:lang w:val="fr-FR"/>
+        </w:rPr>
+        <w:t xml:space="preserve"> publique et privée ont été générés</w:t>
+      </w:r>
+      <w:r>
+        <w:rPr>
+          <w:rFonts w:ascii="Times New Roman" w:hAnsi="Times New Roman" w:cs="Times New Roman"/>
+          <w:lang w:val="fr-FR"/>
+        </w:rPr>
+        <w:t>.</w:t>
+      </w:r>
     </w:p>
     <w:p>
       <w:pPr>
@@ -699,18 +494,315 @@
           <w:bCs/>
           <w:lang w:val="fr-FR"/>
         </w:rPr>
-        <w:lastRenderedPageBreak/>
-        <w:t>CU0</w:t>
-      </w:r>
-      <w:r>
+        <w:t xml:space="preserve">Scénario principal : </w:t>
+      </w:r>
+    </w:p>
+    <w:p>
+      <w:pPr>
+        <w:pStyle w:val="Paragraphedeliste"/>
+        <w:numPr>
+          <w:ilvl w:val="0"/>
+          <w:numId w:val="3"/>
+        </w:numPr>
+        <w:rPr>
+          <w:rFonts w:ascii="Times New Roman" w:hAnsi="Times New Roman" w:cs="Times New Roman"/>
+          <w:lang w:val="fr-FR"/>
+        </w:rPr>
+      </w:pPr>
+      <w:r>
+        <w:rPr>
+          <w:rFonts w:ascii="Times New Roman" w:hAnsi="Times New Roman" w:cs="Times New Roman"/>
+          <w:lang w:val="fr-FR"/>
+        </w:rPr>
+        <w:t xml:space="preserve">L’utilisateur </w:t>
+      </w:r>
+      <w:r>
+        <w:rPr>
+          <w:rFonts w:ascii="Times New Roman" w:hAnsi="Times New Roman" w:cs="Times New Roman"/>
+          <w:lang w:val="fr-FR"/>
+        </w:rPr>
+        <w:t>invoque le programme en lui passant</w:t>
+      </w:r>
+      <w:r>
+        <w:rPr>
+          <w:rFonts w:ascii="Times New Roman" w:hAnsi="Times New Roman" w:cs="Times New Roman"/>
+          <w:lang w:val="fr-FR"/>
+        </w:rPr>
+        <w:t xml:space="preserve"> les arguments</w:t>
+      </w:r>
+      <w:r>
+        <w:rPr>
+          <w:rFonts w:ascii="Times New Roman" w:hAnsi="Times New Roman" w:cs="Times New Roman"/>
+          <w:lang w:val="fr-FR"/>
+        </w:rPr>
+        <w:t xml:space="preserve"> suivants en ordre</w:t>
+      </w:r>
+      <w:r>
+        <w:rPr>
+          <w:rFonts w:ascii="Times New Roman" w:hAnsi="Times New Roman" w:cs="Times New Roman"/>
+          <w:lang w:val="fr-FR"/>
+        </w:rPr>
+        <w:t> :</w:t>
+      </w:r>
+    </w:p>
+    <w:p>
+      <w:pPr>
+        <w:pStyle w:val="Paragraphedeliste"/>
+        <w:numPr>
+          <w:ilvl w:val="1"/>
+          <w:numId w:val="3"/>
+        </w:numPr>
+        <w:rPr>
+          <w:rFonts w:ascii="Times New Roman" w:hAnsi="Times New Roman" w:cs="Times New Roman"/>
+          <w:lang w:val="fr-FR"/>
+        </w:rPr>
+      </w:pPr>
+      <w:r>
+        <w:rPr>
+          <w:rFonts w:ascii="Times New Roman" w:hAnsi="Times New Roman" w:cs="Times New Roman"/>
+          <w:lang w:val="fr-FR"/>
+        </w:rPr>
+        <w:t>L</w:t>
+      </w:r>
+      <w:r>
+        <w:rPr>
+          <w:rFonts w:ascii="Times New Roman" w:hAnsi="Times New Roman" w:cs="Times New Roman"/>
+          <w:lang w:val="fr-FR"/>
+        </w:rPr>
+        <w:t>a commande « </w:t>
+      </w:r>
+      <w:proofErr w:type="spellStart"/>
+      <w:r>
+        <w:rPr>
+          <w:rFonts w:ascii="Times New Roman" w:hAnsi="Times New Roman" w:cs="Times New Roman"/>
+          <w:lang w:val="fr-FR"/>
+        </w:rPr>
+        <w:t>genkeys</w:t>
+      </w:r>
+      <w:proofErr w:type="spellEnd"/>
+      <w:r>
+        <w:rPr>
+          <w:rFonts w:ascii="Times New Roman" w:hAnsi="Times New Roman" w:cs="Times New Roman"/>
+          <w:lang w:val="fr-FR"/>
+        </w:rPr>
+        <w:t> »</w:t>
+      </w:r>
+      <w:r>
+        <w:rPr>
+          <w:rFonts w:ascii="Times New Roman" w:hAnsi="Times New Roman" w:cs="Times New Roman"/>
+          <w:lang w:val="fr-FR"/>
+        </w:rPr>
+        <w:t>.</w:t>
+      </w:r>
+    </w:p>
+    <w:p>
+      <w:pPr>
+        <w:pStyle w:val="Paragraphedeliste"/>
+        <w:numPr>
+          <w:ilvl w:val="1"/>
+          <w:numId w:val="3"/>
+        </w:numPr>
+        <w:rPr>
+          <w:rFonts w:ascii="Times New Roman" w:hAnsi="Times New Roman" w:cs="Times New Roman"/>
+          <w:lang w:val="fr-FR"/>
+        </w:rPr>
+      </w:pPr>
+      <w:r>
+        <w:rPr>
+          <w:rFonts w:ascii="Times New Roman" w:hAnsi="Times New Roman" w:cs="Times New Roman"/>
+          <w:lang w:val="fr-FR"/>
+        </w:rPr>
+        <w:t>U</w:t>
+      </w:r>
+      <w:r>
+        <w:rPr>
+          <w:rFonts w:ascii="Times New Roman" w:hAnsi="Times New Roman" w:cs="Times New Roman"/>
+          <w:lang w:val="fr-FR"/>
+        </w:rPr>
+        <w:t xml:space="preserve">n </w:t>
+      </w:r>
+      <w:r>
+        <w:rPr>
+          <w:rFonts w:ascii="Times New Roman" w:hAnsi="Times New Roman" w:cs="Times New Roman"/>
+          <w:lang w:val="fr-FR"/>
+        </w:rPr>
+        <w:t xml:space="preserve">premier </w:t>
+      </w:r>
+      <w:r>
+        <w:rPr>
+          <w:rFonts w:ascii="Times New Roman" w:hAnsi="Times New Roman" w:cs="Times New Roman"/>
+          <w:lang w:val="fr-FR"/>
+        </w:rPr>
+        <w:t>nombre premier</w:t>
+      </w:r>
+      <w:r>
+        <w:rPr>
+          <w:rFonts w:ascii="Times New Roman" w:hAnsi="Times New Roman" w:cs="Times New Roman"/>
+          <w:lang w:val="fr-FR"/>
+        </w:rPr>
+        <w:t>, noté</w:t>
+      </w:r>
+      <w:r>
+        <w:rPr>
+          <w:rFonts w:ascii="Times New Roman" w:hAnsi="Times New Roman" w:cs="Times New Roman"/>
+          <w:lang w:val="fr-FR"/>
+        </w:rPr>
+        <w:t xml:space="preserve"> (p)</w:t>
+      </w:r>
+      <w:r>
+        <w:rPr>
+          <w:rFonts w:ascii="Times New Roman" w:hAnsi="Times New Roman" w:cs="Times New Roman"/>
+          <w:lang w:val="fr-FR"/>
+        </w:rPr>
+        <w:t>.</w:t>
+      </w:r>
+    </w:p>
+    <w:p>
+      <w:pPr>
+        <w:pStyle w:val="Paragraphedeliste"/>
+        <w:numPr>
+          <w:ilvl w:val="1"/>
+          <w:numId w:val="3"/>
+        </w:numPr>
+        <w:rPr>
+          <w:rFonts w:ascii="Times New Roman" w:hAnsi="Times New Roman" w:cs="Times New Roman"/>
+          <w:lang w:val="fr-FR"/>
+        </w:rPr>
+      </w:pPr>
+      <w:r>
+        <w:rPr>
+          <w:rFonts w:ascii="Times New Roman" w:hAnsi="Times New Roman" w:cs="Times New Roman"/>
+          <w:lang w:val="fr-FR"/>
+        </w:rPr>
+        <w:t>U</w:t>
+      </w:r>
+      <w:r>
+        <w:rPr>
+          <w:rFonts w:ascii="Times New Roman" w:hAnsi="Times New Roman" w:cs="Times New Roman"/>
+          <w:lang w:val="fr-FR"/>
+        </w:rPr>
+        <w:t xml:space="preserve">n </w:t>
+      </w:r>
+      <w:r>
+        <w:rPr>
+          <w:rFonts w:ascii="Times New Roman" w:hAnsi="Times New Roman" w:cs="Times New Roman"/>
+          <w:lang w:val="fr-FR"/>
+        </w:rPr>
+        <w:t xml:space="preserve">deuxième </w:t>
+      </w:r>
+      <w:r>
+        <w:rPr>
+          <w:rFonts w:ascii="Times New Roman" w:hAnsi="Times New Roman" w:cs="Times New Roman"/>
+          <w:lang w:val="fr-FR"/>
+        </w:rPr>
+        <w:t>nombre premier</w:t>
+      </w:r>
+      <w:r>
+        <w:rPr>
+          <w:rFonts w:ascii="Times New Roman" w:hAnsi="Times New Roman" w:cs="Times New Roman"/>
+          <w:lang w:val="fr-FR"/>
+        </w:rPr>
+        <w:t>, noté</w:t>
+      </w:r>
+      <w:r>
+        <w:rPr>
+          <w:rFonts w:ascii="Times New Roman" w:hAnsi="Times New Roman" w:cs="Times New Roman"/>
+          <w:lang w:val="fr-FR"/>
+        </w:rPr>
+        <w:t xml:space="preserve"> (q)</w:t>
+      </w:r>
+      <w:r>
+        <w:rPr>
+          <w:rFonts w:ascii="Times New Roman" w:hAnsi="Times New Roman" w:cs="Times New Roman"/>
+          <w:lang w:val="fr-FR"/>
+        </w:rPr>
+        <w:t>.</w:t>
+      </w:r>
+    </w:p>
+    <w:p>
+      <w:pPr>
+        <w:pStyle w:val="Paragraphedeliste"/>
+        <w:numPr>
+          <w:ilvl w:val="1"/>
+          <w:numId w:val="3"/>
+        </w:numPr>
+        <w:rPr>
+          <w:rFonts w:ascii="Times New Roman" w:hAnsi="Times New Roman" w:cs="Times New Roman"/>
+          <w:lang w:val="fr-FR"/>
+        </w:rPr>
+      </w:pPr>
+      <w:r>
+        <w:rPr>
+          <w:rFonts w:ascii="Times New Roman" w:hAnsi="Times New Roman" w:cs="Times New Roman"/>
+          <w:lang w:val="fr-FR"/>
+        </w:rPr>
+        <w:t xml:space="preserve">Un nombre </w:t>
+      </w:r>
+      <w:r>
+        <w:rPr>
+          <w:rFonts w:ascii="Times New Roman" w:hAnsi="Times New Roman" w:cs="Times New Roman"/>
+          <w:lang w:val="fr-FR"/>
+        </w:rPr>
+        <w:t>inversible modulo s</w:t>
+      </w:r>
+      <w:r>
+        <w:rPr>
+          <w:rFonts w:ascii="Times New Roman" w:hAnsi="Times New Roman" w:cs="Times New Roman"/>
+          <w:lang w:val="fr-FR"/>
+        </w:rPr>
+        <w:t xml:space="preserve"> = (p-1) (q-1), noté</w:t>
+      </w:r>
+      <w:r>
+        <w:rPr>
+          <w:rFonts w:ascii="Times New Roman" w:hAnsi="Times New Roman" w:cs="Times New Roman"/>
+          <w:lang w:val="fr-FR"/>
+        </w:rPr>
+        <w:t xml:space="preserve"> (e)</w:t>
+      </w:r>
+      <w:r>
+        <w:rPr>
+          <w:rFonts w:ascii="Times New Roman" w:hAnsi="Times New Roman" w:cs="Times New Roman"/>
+          <w:lang w:val="fr-FR"/>
+        </w:rPr>
+        <w:t>.</w:t>
+      </w:r>
+    </w:p>
+    <w:p>
+      <w:pPr>
+        <w:pStyle w:val="Paragraphedeliste"/>
+        <w:numPr>
+          <w:ilvl w:val="0"/>
+          <w:numId w:val="3"/>
+        </w:numPr>
+        <w:rPr>
+          <w:rFonts w:ascii="Times New Roman" w:hAnsi="Times New Roman" w:cs="Times New Roman"/>
+          <w:lang w:val="fr-FR"/>
+        </w:rPr>
+      </w:pPr>
+      <w:r>
+        <w:rPr>
+          <w:rFonts w:ascii="Times New Roman" w:hAnsi="Times New Roman" w:cs="Times New Roman"/>
+          <w:lang w:val="fr-FR"/>
+        </w:rPr>
+        <w:t>Le programme génère les clés privées et publiques</w:t>
+      </w:r>
+      <w:r>
+        <w:rPr>
+          <w:rFonts w:ascii="Times New Roman" w:hAnsi="Times New Roman" w:cs="Times New Roman"/>
+          <w:lang w:val="fr-FR"/>
+        </w:rPr>
+        <w:t>.</w:t>
+      </w:r>
+    </w:p>
+    <w:p>
+      <w:pPr>
         <w:rPr>
           <w:rFonts w:ascii="Times New Roman" w:hAnsi="Times New Roman" w:cs="Times New Roman"/>
           <w:b/>
           <w:bCs/>
           <w:lang w:val="fr-FR"/>
         </w:rPr>
-        <w:t>3</w:t>
-      </w:r>
+      </w:pPr>
       <w:r>
         <w:rPr>
           <w:rFonts w:ascii="Times New Roman" w:hAnsi="Times New Roman" w:cs="Times New Roman"/>
@@ -718,51 +810,305 @@
           <w:bCs/>
           <w:lang w:val="fr-FR"/>
         </w:rPr>
-        <w:t xml:space="preserve"> </w:t>
-      </w:r>
-      <w:r>
+        <w:t>Scénarios alternatifs :</w:t>
+      </w:r>
+    </w:p>
+    <w:p>
+      <w:pPr>
+        <w:rPr>
+          <w:rFonts w:ascii="Times New Roman" w:hAnsi="Times New Roman" w:cs="Times New Roman"/>
+          <w:lang w:val="fr-FR"/>
+        </w:rPr>
+      </w:pPr>
+      <w:r>
+        <w:rPr>
+          <w:rFonts w:ascii="Times New Roman" w:hAnsi="Times New Roman" w:cs="Times New Roman"/>
+          <w:lang w:val="fr-FR"/>
+        </w:rPr>
+        <w:tab/>
+        <w:t xml:space="preserve">1a. </w:t>
+      </w:r>
+      <w:r>
+        <w:rPr>
+          <w:rFonts w:ascii="Times New Roman" w:hAnsi="Times New Roman" w:cs="Times New Roman"/>
+          <w:lang w:val="fr-FR"/>
+        </w:rPr>
+        <w:t>Le premier ou deuxième nombre saisie n’est pas un nombre premier.</w:t>
+      </w:r>
+    </w:p>
+    <w:p>
+      <w:pPr>
+        <w:pStyle w:val="Paragraphedeliste"/>
+        <w:numPr>
+          <w:ilvl w:val="0"/>
+          <w:numId w:val="5"/>
+        </w:numPr>
+        <w:rPr>
+          <w:rFonts w:ascii="Times New Roman" w:hAnsi="Times New Roman" w:cs="Times New Roman"/>
+          <w:lang w:val="fr-FR"/>
+        </w:rPr>
+      </w:pPr>
+      <w:r>
+        <w:rPr>
+          <w:rFonts w:ascii="Times New Roman" w:hAnsi="Times New Roman" w:cs="Times New Roman"/>
+          <w:lang w:val="fr-FR"/>
+        </w:rPr>
+        <w:t>Le système signale l’erreur et rejette la saisie.</w:t>
+      </w:r>
+    </w:p>
+    <w:p>
+      <w:pPr>
+        <w:pStyle w:val="Paragraphedeliste"/>
+        <w:numPr>
+          <w:ilvl w:val="0"/>
+          <w:numId w:val="5"/>
+        </w:numPr>
+        <w:rPr>
+          <w:rFonts w:ascii="Times New Roman" w:hAnsi="Times New Roman" w:cs="Times New Roman"/>
+          <w:lang w:val="fr-FR"/>
+        </w:rPr>
+      </w:pPr>
+      <w:r>
+        <w:rPr>
+          <w:rFonts w:ascii="Times New Roman" w:hAnsi="Times New Roman" w:cs="Times New Roman"/>
+          <w:lang w:val="fr-FR"/>
+        </w:rPr>
+        <w:t>Fin de l’exécution.</w:t>
+      </w:r>
+    </w:p>
+    <w:p>
+      <w:pPr>
+        <w:ind w:firstLine="708"/>
+        <w:rPr>
+          <w:rFonts w:ascii="Times New Roman" w:hAnsi="Times New Roman" w:cs="Times New Roman"/>
+          <w:lang w:val="fr-FR"/>
+        </w:rPr>
+      </w:pPr>
+      <w:r>
+        <w:rPr>
+          <w:rFonts w:ascii="Times New Roman" w:hAnsi="Times New Roman" w:cs="Times New Roman"/>
+          <w:lang w:val="fr-FR"/>
+        </w:rPr>
+        <w:t>2a. Le troisième nombre saisie n’est pas inversible modulo s.</w:t>
+      </w:r>
+    </w:p>
+    <w:p>
+      <w:pPr>
+        <w:pStyle w:val="Paragraphedeliste"/>
+        <w:numPr>
+          <w:ilvl w:val="0"/>
+          <w:numId w:val="6"/>
+        </w:numPr>
+        <w:rPr>
+          <w:rFonts w:ascii="Times New Roman" w:hAnsi="Times New Roman" w:cs="Times New Roman"/>
+          <w:lang w:val="fr-FR"/>
+        </w:rPr>
+      </w:pPr>
+      <w:r>
+        <w:rPr>
+          <w:rFonts w:ascii="Times New Roman" w:hAnsi="Times New Roman" w:cs="Times New Roman"/>
+          <w:lang w:val="fr-FR"/>
+        </w:rPr>
+        <w:t>Le système signale l’erreur et rejette la saisie.</w:t>
+      </w:r>
+    </w:p>
+    <w:p>
+      <w:pPr>
+        <w:pStyle w:val="Paragraphedeliste"/>
+        <w:numPr>
+          <w:ilvl w:val="0"/>
+          <w:numId w:val="6"/>
+        </w:numPr>
+        <w:rPr>
+          <w:rFonts w:ascii="Times New Roman" w:hAnsi="Times New Roman" w:cs="Times New Roman"/>
+          <w:lang w:val="fr-FR"/>
+        </w:rPr>
+      </w:pPr>
+      <w:r>
+        <w:rPr>
+          <w:rFonts w:ascii="Times New Roman" w:hAnsi="Times New Roman" w:cs="Times New Roman"/>
+          <w:lang w:val="fr-FR"/>
+        </w:rPr>
+        <w:t>Fin de l’exécution.</w:t>
+      </w:r>
+    </w:p>
+    <w:p>
+      <w:pPr>
         <w:rPr>
           <w:rFonts w:ascii="Times New Roman" w:hAnsi="Times New Roman" w:cs="Times New Roman"/>
           <w:b/>
           <w:bCs/>
           <w:lang w:val="fr-FR"/>
         </w:rPr>
-        <w:t>Décrypter à l’aide de la clé privée</w:t>
-      </w:r>
-    </w:p>
-    <w:p>
-      <w:pPr>
-        <w:rPr>
-          <w:rFonts w:ascii="Times New Roman" w:hAnsi="Times New Roman" w:cs="Times New Roman"/>
-          <w:lang w:val="fr-FR"/>
-        </w:rPr>
-      </w:pPr>
-      <w:r>
-        <w:rPr>
-          <w:rFonts w:ascii="Times New Roman" w:hAnsi="Times New Roman" w:cs="Times New Roman"/>
-          <w:lang w:val="fr-FR"/>
-        </w:rPr>
-        <w:t xml:space="preserve">Acteur principal : </w:t>
-      </w:r>
-    </w:p>
-    <w:p>
-      <w:pPr>
-        <w:rPr>
-          <w:rFonts w:ascii="Times New Roman" w:hAnsi="Times New Roman" w:cs="Times New Roman"/>
-          <w:lang w:val="fr-FR"/>
-        </w:rPr>
-      </w:pPr>
-    </w:p>
-    <w:p>
-      <w:pPr>
-        <w:rPr>
-          <w:rFonts w:ascii="Times New Roman" w:hAnsi="Times New Roman" w:cs="Times New Roman"/>
-          <w:lang w:val="fr-FR"/>
-        </w:rPr>
-      </w:pPr>
-      <w:r>
-        <w:rPr>
-          <w:rFonts w:ascii="Times New Roman" w:hAnsi="Times New Roman" w:cs="Times New Roman"/>
+      </w:pPr>
+      <w:r>
+        <w:rPr>
+          <w:rFonts w:ascii="Times New Roman" w:hAnsi="Times New Roman" w:cs="Times New Roman"/>
+          <w:b/>
+          <w:bCs/>
+          <w:lang w:val="fr-FR"/>
+        </w:rPr>
+        <w:t>Tests supplémentaires :</w:t>
+      </w:r>
+    </w:p>
+    <w:p>
+      <w:pPr>
+        <w:pStyle w:val="Paragraphedeliste"/>
+        <w:numPr>
+          <w:ilvl w:val="0"/>
+          <w:numId w:val="7"/>
+        </w:numPr>
+        <w:rPr>
+          <w:rFonts w:ascii="Times New Roman" w:hAnsi="Times New Roman" w:cs="Times New Roman"/>
+          <w:lang w:val="fr-FR"/>
+        </w:rPr>
+      </w:pPr>
+      <w:r>
+        <w:rPr>
+          <w:rFonts w:ascii="Times New Roman" w:hAnsi="Times New Roman" w:cs="Times New Roman"/>
+          <w:lang w:val="fr-FR"/>
+        </w:rPr>
+        <w:t>Démontrer que les clés sont générées correctement.</w:t>
+      </w:r>
+    </w:p>
+    <w:p>
+      <w:pPr>
+        <w:pStyle w:val="Paragraphedeliste"/>
+        <w:numPr>
+          <w:ilvl w:val="0"/>
+          <w:numId w:val="7"/>
+        </w:numPr>
+        <w:rPr>
+          <w:rFonts w:ascii="Times New Roman" w:hAnsi="Times New Roman" w:cs="Times New Roman"/>
+          <w:lang w:val="fr-FR"/>
+        </w:rPr>
+      </w:pPr>
+      <w:r>
+        <w:rPr>
+          <w:rFonts w:ascii="Times New Roman" w:hAnsi="Times New Roman" w:cs="Times New Roman"/>
+          <w:lang w:val="fr-FR"/>
+        </w:rPr>
+        <w:t>Démontrer que la validation des nombre premiers fonctionne.</w:t>
+      </w:r>
+    </w:p>
+    <w:p>
+      <w:pPr>
+        <w:pStyle w:val="Paragraphedeliste"/>
+        <w:numPr>
+          <w:ilvl w:val="0"/>
+          <w:numId w:val="7"/>
+        </w:numPr>
+        <w:rPr>
+          <w:rFonts w:ascii="Times New Roman" w:hAnsi="Times New Roman" w:cs="Times New Roman"/>
+          <w:lang w:val="fr-FR"/>
+        </w:rPr>
+      </w:pPr>
+      <w:r>
+        <w:rPr>
+          <w:rFonts w:ascii="Times New Roman" w:hAnsi="Times New Roman" w:cs="Times New Roman"/>
+          <w:lang w:val="fr-FR"/>
+        </w:rPr>
+        <w:t>Démontrer que la validation de l’argument (e) fonctionne.</w:t>
+      </w:r>
+      <w:r>
+        <w:rPr>
+          <w:rFonts w:ascii="Times New Roman" w:hAnsi="Times New Roman" w:cs="Times New Roman"/>
+          <w:lang w:val="fr-FR"/>
+        </w:rPr>
+        <w:br/>
+      </w:r>
+    </w:p>
+    <w:p>
+      <w:pPr>
+        <w:rPr>
+          <w:rFonts w:ascii="Times New Roman" w:hAnsi="Times New Roman" w:cs="Times New Roman"/>
+          <w:lang w:val="fr-FR"/>
+        </w:rPr>
+      </w:pPr>
+      <w:r>
+        <w:rPr>
+          <w:rFonts w:ascii="Times New Roman" w:hAnsi="Times New Roman" w:cs="Times New Roman"/>
+          <w:lang w:val="fr-FR"/>
+        </w:rPr>
+        <w:br w:type="page"/>
+      </w:r>
+    </w:p>
+    <w:p>
+      <w:pPr>
+        <w:rPr>
+          <w:rFonts w:ascii="Times New Roman" w:hAnsi="Times New Roman" w:cs="Times New Roman"/>
+          <w:b/>
+          <w:bCs/>
+          <w:sz w:val="26"/>
+          <w:szCs w:val="26"/>
+          <w:lang w:val="fr-FR"/>
+        </w:rPr>
+      </w:pPr>
+      <w:r>
+        <w:rPr>
+          <w:rFonts w:ascii="Times New Roman" w:hAnsi="Times New Roman" w:cs="Times New Roman"/>
+          <w:b/>
+          <w:bCs/>
+          <w:sz w:val="26"/>
+          <w:szCs w:val="26"/>
+          <w:lang w:val="fr-FR"/>
+        </w:rPr>
+        <w:lastRenderedPageBreak/>
+        <w:t>CU02 Encrypter à l’aide de la clé publique</w:t>
+      </w:r>
+    </w:p>
+    <w:p>
+      <w:pPr>
+        <w:rPr>
+          <w:rFonts w:ascii="Times New Roman" w:hAnsi="Times New Roman" w:cs="Times New Roman"/>
+          <w:lang w:val="fr-FR"/>
+        </w:rPr>
+      </w:pPr>
+      <w:r>
+        <w:rPr>
+          <w:rFonts w:ascii="Times New Roman" w:hAnsi="Times New Roman" w:cs="Times New Roman"/>
+          <w:b/>
+          <w:bCs/>
+          <w:lang w:val="fr-FR"/>
+        </w:rPr>
+        <w:t>Acteur principal :</w:t>
+      </w:r>
+      <w:r>
+        <w:rPr>
+          <w:rFonts w:ascii="Times New Roman" w:hAnsi="Times New Roman" w:cs="Times New Roman"/>
+          <w:lang w:val="fr-FR"/>
+        </w:rPr>
+        <w:t xml:space="preserve"> </w:t>
+      </w:r>
+      <w:r>
+        <w:rPr>
+          <w:rFonts w:ascii="Times New Roman" w:hAnsi="Times New Roman" w:cs="Times New Roman"/>
+          <w:lang w:val="fr-FR"/>
+        </w:rPr>
+        <w:t>Utilisateur envoyeur</w:t>
+      </w:r>
+      <w:r>
+        <w:rPr>
+          <w:rFonts w:ascii="Times New Roman" w:hAnsi="Times New Roman" w:cs="Times New Roman"/>
+          <w:lang w:val="fr-FR"/>
+        </w:rPr>
+        <w:t>.</w:t>
+      </w:r>
+    </w:p>
+    <w:p>
+      <w:pPr>
+        <w:rPr>
+          <w:rFonts w:ascii="Times New Roman" w:hAnsi="Times New Roman" w:cs="Times New Roman"/>
+          <w:b/>
+          <w:bCs/>
+          <w:lang w:val="fr-FR"/>
+        </w:rPr>
+      </w:pPr>
+      <w:r>
+        <w:rPr>
+          <w:rFonts w:ascii="Times New Roman" w:hAnsi="Times New Roman" w:cs="Times New Roman"/>
+          <w:b/>
+          <w:bCs/>
           <w:lang w:val="fr-FR"/>
         </w:rPr>
         <w:t xml:space="preserve">Préconditions : </w:t>
@@ -770,22 +1116,45 @@
     </w:p>
     <w:p>
       <w:pPr>
-        <w:rPr>
-          <w:rFonts w:ascii="Times New Roman" w:hAnsi="Times New Roman" w:cs="Times New Roman"/>
-          <w:lang w:val="fr-FR"/>
-        </w:rPr>
-      </w:pPr>
-    </w:p>
-    <w:p>
-      <w:pPr>
-        <w:rPr>
-          <w:rFonts w:ascii="Times New Roman" w:hAnsi="Times New Roman" w:cs="Times New Roman"/>
-          <w:lang w:val="fr-FR"/>
-        </w:rPr>
-      </w:pPr>
-      <w:r>
-        <w:rPr>
-          <w:rFonts w:ascii="Times New Roman" w:hAnsi="Times New Roman" w:cs="Times New Roman"/>
+        <w:pStyle w:val="Paragraphedeliste"/>
+        <w:numPr>
+          <w:ilvl w:val="0"/>
+          <w:numId w:val="1"/>
+        </w:numPr>
+        <w:rPr>
+          <w:rFonts w:ascii="Times New Roman" w:hAnsi="Times New Roman" w:cs="Times New Roman"/>
+          <w:lang w:val="fr-FR"/>
+        </w:rPr>
+      </w:pPr>
+      <w:r>
+        <w:rPr>
+          <w:rFonts w:ascii="Times New Roman" w:hAnsi="Times New Roman" w:cs="Times New Roman"/>
+          <w:lang w:val="fr-FR"/>
+        </w:rPr>
+        <w:t>La clé publique est générée</w:t>
+      </w:r>
+      <w:r>
+        <w:rPr>
+          <w:rFonts w:ascii="Times New Roman" w:hAnsi="Times New Roman" w:cs="Times New Roman"/>
+          <w:lang w:val="fr-FR"/>
+        </w:rPr>
+        <w:t>.</w:t>
+      </w:r>
+    </w:p>
+    <w:p>
+      <w:pPr>
+        <w:rPr>
+          <w:rFonts w:ascii="Times New Roman" w:hAnsi="Times New Roman" w:cs="Times New Roman"/>
+          <w:b/>
+          <w:bCs/>
+          <w:lang w:val="fr-FR"/>
+        </w:rPr>
+      </w:pPr>
+      <w:r>
+        <w:rPr>
+          <w:rFonts w:ascii="Times New Roman" w:hAnsi="Times New Roman" w:cs="Times New Roman"/>
+          <w:b/>
+          <w:bCs/>
           <w:lang w:val="fr-FR"/>
         </w:rPr>
         <w:t>Postconditions :</w:t>
@@ -793,22 +1162,59 @@
     </w:p>
     <w:p>
       <w:pPr>
-        <w:rPr>
-          <w:rFonts w:ascii="Times New Roman" w:hAnsi="Times New Roman" w:cs="Times New Roman"/>
-          <w:lang w:val="fr-FR"/>
-        </w:rPr>
-      </w:pPr>
-    </w:p>
-    <w:p>
-      <w:pPr>
-        <w:rPr>
-          <w:rFonts w:ascii="Times New Roman" w:hAnsi="Times New Roman" w:cs="Times New Roman"/>
-          <w:lang w:val="fr-FR"/>
-        </w:rPr>
-      </w:pPr>
-      <w:r>
-        <w:rPr>
-          <w:rFonts w:ascii="Times New Roman" w:hAnsi="Times New Roman" w:cs="Times New Roman"/>
+        <w:pStyle w:val="Paragraphedeliste"/>
+        <w:numPr>
+          <w:ilvl w:val="0"/>
+          <w:numId w:val="1"/>
+        </w:numPr>
+        <w:rPr>
+          <w:rFonts w:ascii="Times New Roman" w:hAnsi="Times New Roman" w:cs="Times New Roman"/>
+          <w:lang w:val="fr-FR"/>
+        </w:rPr>
+      </w:pPr>
+      <w:r>
+        <w:rPr>
+          <w:rFonts w:ascii="Times New Roman" w:hAnsi="Times New Roman" w:cs="Times New Roman"/>
+          <w:lang w:val="fr-FR"/>
+        </w:rPr>
+        <w:t xml:space="preserve">Le message </w:t>
+      </w:r>
+      <w:r>
+        <w:rPr>
+          <w:rFonts w:ascii="Times New Roman" w:hAnsi="Times New Roman" w:cs="Times New Roman"/>
+          <w:lang w:val="fr-FR"/>
+        </w:rPr>
+        <w:t>a</w:t>
+      </w:r>
+      <w:r>
+        <w:rPr>
+          <w:rFonts w:ascii="Times New Roman" w:hAnsi="Times New Roman" w:cs="Times New Roman"/>
+          <w:lang w:val="fr-FR"/>
+        </w:rPr>
+        <w:t xml:space="preserve"> été encrypté</w:t>
+      </w:r>
+      <w:r>
+        <w:rPr>
+          <w:rFonts w:ascii="Times New Roman" w:hAnsi="Times New Roman" w:cs="Times New Roman"/>
+          <w:lang w:val="fr-FR"/>
+        </w:rPr>
+        <w:t>.</w:t>
+      </w:r>
+    </w:p>
+    <w:p>
+      <w:pPr>
+        <w:rPr>
+          <w:rFonts w:ascii="Times New Roman" w:hAnsi="Times New Roman" w:cs="Times New Roman"/>
+          <w:b/>
+          <w:bCs/>
+          <w:lang w:val="fr-FR"/>
+        </w:rPr>
+      </w:pPr>
+      <w:r>
+        <w:rPr>
+          <w:rFonts w:ascii="Times New Roman" w:hAnsi="Times New Roman" w:cs="Times New Roman"/>
+          <w:b/>
+          <w:bCs/>
           <w:lang w:val="fr-FR"/>
         </w:rPr>
         <w:t xml:space="preserve">Scénario principal : </w:t>
@@ -816,22 +1222,148 @@
     </w:p>
     <w:p>
       <w:pPr>
-        <w:rPr>
-          <w:rFonts w:ascii="Times New Roman" w:hAnsi="Times New Roman" w:cs="Times New Roman"/>
-          <w:lang w:val="fr-FR"/>
-        </w:rPr>
-      </w:pPr>
-    </w:p>
-    <w:p>
-      <w:pPr>
-        <w:rPr>
-          <w:rFonts w:ascii="Times New Roman" w:hAnsi="Times New Roman" w:cs="Times New Roman"/>
-          <w:lang w:val="fr-FR"/>
-        </w:rPr>
-      </w:pPr>
-      <w:r>
-        <w:rPr>
-          <w:rFonts w:ascii="Times New Roman" w:hAnsi="Times New Roman" w:cs="Times New Roman"/>
+        <w:pStyle w:val="Paragraphedeliste"/>
+        <w:numPr>
+          <w:ilvl w:val="0"/>
+          <w:numId w:val="8"/>
+        </w:numPr>
+        <w:rPr>
+          <w:rFonts w:ascii="Times New Roman" w:hAnsi="Times New Roman" w:cs="Times New Roman"/>
+          <w:lang w:val="fr-FR"/>
+        </w:rPr>
+      </w:pPr>
+      <w:r>
+        <w:rPr>
+          <w:rFonts w:ascii="Times New Roman" w:hAnsi="Times New Roman" w:cs="Times New Roman"/>
+          <w:lang w:val="fr-FR"/>
+        </w:rPr>
+        <w:t>L’utilisateur invoque le programme en lui passant les arguments suivants en ordre :</w:t>
+      </w:r>
+    </w:p>
+    <w:p>
+      <w:pPr>
+        <w:pStyle w:val="Paragraphedeliste"/>
+        <w:numPr>
+          <w:ilvl w:val="0"/>
+          <w:numId w:val="9"/>
+        </w:numPr>
+        <w:rPr>
+          <w:rFonts w:ascii="Times New Roman" w:hAnsi="Times New Roman" w:cs="Times New Roman"/>
+          <w:lang w:val="fr-FR"/>
+        </w:rPr>
+      </w:pPr>
+      <w:r>
+        <w:rPr>
+          <w:rFonts w:ascii="Times New Roman" w:hAnsi="Times New Roman" w:cs="Times New Roman"/>
+          <w:lang w:val="fr-FR"/>
+        </w:rPr>
+        <w:t>La commande « </w:t>
+      </w:r>
+      <w:proofErr w:type="spellStart"/>
+      <w:r>
+        <w:rPr>
+          <w:rFonts w:ascii="Times New Roman" w:hAnsi="Times New Roman" w:cs="Times New Roman"/>
+          <w:lang w:val="fr-FR"/>
+        </w:rPr>
+        <w:t>encrypt</w:t>
+      </w:r>
+      <w:proofErr w:type="spellEnd"/>
+      <w:r>
+        <w:rPr>
+          <w:rFonts w:ascii="Times New Roman" w:hAnsi="Times New Roman" w:cs="Times New Roman"/>
+          <w:lang w:val="fr-FR"/>
+        </w:rPr>
+        <w:t> »</w:t>
+      </w:r>
+      <w:r>
+        <w:rPr>
+          <w:rFonts w:ascii="Times New Roman" w:hAnsi="Times New Roman" w:cs="Times New Roman"/>
+          <w:lang w:val="fr-FR"/>
+        </w:rPr>
+        <w:t>.</w:t>
+      </w:r>
+    </w:p>
+    <w:p>
+      <w:pPr>
+        <w:pStyle w:val="Paragraphedeliste"/>
+        <w:numPr>
+          <w:ilvl w:val="0"/>
+          <w:numId w:val="9"/>
+        </w:numPr>
+        <w:rPr>
+          <w:rFonts w:ascii="Times New Roman" w:hAnsi="Times New Roman" w:cs="Times New Roman"/>
+          <w:lang w:val="fr-FR"/>
+        </w:rPr>
+      </w:pPr>
+      <w:r>
+        <w:rPr>
+          <w:rFonts w:ascii="Times New Roman" w:hAnsi="Times New Roman" w:cs="Times New Roman"/>
+          <w:lang w:val="fr-FR"/>
+        </w:rPr>
+        <w:t>Le chemin local de clé publique.</w:t>
+      </w:r>
+    </w:p>
+    <w:p>
+      <w:pPr>
+        <w:pStyle w:val="Paragraphedeliste"/>
+        <w:numPr>
+          <w:ilvl w:val="0"/>
+          <w:numId w:val="9"/>
+        </w:numPr>
+        <w:rPr>
+          <w:rFonts w:ascii="Times New Roman" w:hAnsi="Times New Roman" w:cs="Times New Roman"/>
+          <w:lang w:val="fr-FR"/>
+        </w:rPr>
+      </w:pPr>
+      <w:r>
+        <w:rPr>
+          <w:rFonts w:ascii="Times New Roman" w:hAnsi="Times New Roman" w:cs="Times New Roman"/>
+          <w:lang w:val="fr-FR"/>
+        </w:rPr>
+        <w:t>La chaine de caractères à encrypter</w:t>
+      </w:r>
+      <w:r>
+        <w:rPr>
+          <w:rFonts w:ascii="Times New Roman" w:hAnsi="Times New Roman" w:cs="Times New Roman"/>
+          <w:lang w:val="fr-FR"/>
+        </w:rPr>
+        <w:t>.</w:t>
+      </w:r>
+    </w:p>
+    <w:p>
+      <w:pPr>
+        <w:pStyle w:val="Paragraphedeliste"/>
+        <w:numPr>
+          <w:ilvl w:val="0"/>
+          <w:numId w:val="8"/>
+        </w:numPr>
+        <w:rPr>
+          <w:rFonts w:ascii="Times New Roman" w:hAnsi="Times New Roman" w:cs="Times New Roman"/>
+          <w:lang w:val="fr-FR"/>
+        </w:rPr>
+      </w:pPr>
+      <w:r>
+        <w:rPr>
+          <w:rFonts w:ascii="Times New Roman" w:hAnsi="Times New Roman" w:cs="Times New Roman"/>
+          <w:lang w:val="fr-FR"/>
+        </w:rPr>
+        <w:t>Le programme imprime la chaine de caractères encrypté.</w:t>
+      </w:r>
+    </w:p>
+    <w:p>
+      <w:pPr>
+        <w:rPr>
+          <w:rFonts w:ascii="Times New Roman" w:hAnsi="Times New Roman" w:cs="Times New Roman"/>
+          <w:b/>
+          <w:bCs/>
+          <w:lang w:val="fr-FR"/>
+        </w:rPr>
+      </w:pPr>
+      <w:r>
+        <w:rPr>
+          <w:rFonts w:ascii="Times New Roman" w:hAnsi="Times New Roman" w:cs="Times New Roman"/>
+          <w:b/>
+          <w:bCs/>
           <w:lang w:val="fr-FR"/>
         </w:rPr>
         <w:t>Scénarios alternatifs :</w:t>
@@ -839,22 +1371,38 @@
     </w:p>
     <w:p>
       <w:pPr>
-        <w:rPr>
-          <w:rFonts w:ascii="Times New Roman" w:hAnsi="Times New Roman" w:cs="Times New Roman"/>
-          <w:lang w:val="fr-FR"/>
-        </w:rPr>
-      </w:pPr>
-    </w:p>
-    <w:p>
-      <w:pPr>
-        <w:rPr>
-          <w:rFonts w:ascii="Times New Roman" w:hAnsi="Times New Roman" w:cs="Times New Roman"/>
-          <w:lang w:val="fr-FR"/>
-        </w:rPr>
-      </w:pPr>
-      <w:r>
-        <w:rPr>
-          <w:rFonts w:ascii="Times New Roman" w:hAnsi="Times New Roman" w:cs="Times New Roman"/>
+        <w:pStyle w:val="Paragraphedeliste"/>
+        <w:numPr>
+          <w:ilvl w:val="0"/>
+          <w:numId w:val="1"/>
+        </w:numPr>
+        <w:rPr>
+          <w:rFonts w:ascii="Times New Roman" w:hAnsi="Times New Roman" w:cs="Times New Roman"/>
+          <w:lang w:val="fr-FR"/>
+        </w:rPr>
+      </w:pPr>
+      <w:r>
+        <w:rPr>
+          <w:rFonts w:ascii="Times New Roman" w:hAnsi="Times New Roman" w:cs="Times New Roman"/>
+          <w:lang w:val="fr-FR"/>
+        </w:rPr>
+        <w:t>Aucun scénario alternatif.</w:t>
+      </w:r>
+    </w:p>
+    <w:p>
+      <w:pPr>
+        <w:rPr>
+          <w:rFonts w:ascii="Times New Roman" w:hAnsi="Times New Roman" w:cs="Times New Roman"/>
+          <w:b/>
+          <w:bCs/>
+          <w:lang w:val="fr-FR"/>
+        </w:rPr>
+      </w:pPr>
+      <w:r>
+        <w:rPr>
+          <w:rFonts w:ascii="Times New Roman" w:hAnsi="Times New Roman" w:cs="Times New Roman"/>
+          <w:b/>
+          <w:bCs/>
           <w:lang w:val="fr-FR"/>
         </w:rPr>
         <w:t>Tests supplémentaires :</w:t>
@@ -862,30 +1410,567 @@
     </w:p>
     <w:p>
       <w:pPr>
-        <w:rPr>
-          <w:lang w:val="fr-FR"/>
-        </w:rPr>
-      </w:pPr>
-    </w:p>
-    <w:p>
-      <w:pPr>
-        <w:rPr>
-          <w:lang w:val="fr-FR"/>
-        </w:rPr>
-      </w:pPr>
-    </w:p>
-    <w:p>
-      <w:pPr>
-        <w:rPr>
-          <w:lang w:val="fr-FR"/>
-        </w:rPr>
-      </w:pPr>
-      <w:r>
-        <w:rPr>
-          <w:lang w:val="fr-FR"/>
-        </w:rPr>
-        <w:t>https://github.com/profcfuhrmanets/log210-enonce-lab1/blob/main/README-exigences-client.md#cu01a-ajouter-cours</w:t>
-      </w:r>
+        <w:pStyle w:val="Paragraphedeliste"/>
+        <w:numPr>
+          <w:ilvl w:val="0"/>
+          <w:numId w:val="10"/>
+        </w:numPr>
+        <w:rPr>
+          <w:rFonts w:ascii="Times New Roman" w:hAnsi="Times New Roman" w:cs="Times New Roman"/>
+          <w:lang w:val="fr-FR"/>
+        </w:rPr>
+      </w:pPr>
+      <w:r>
+        <w:rPr>
+          <w:rFonts w:ascii="Times New Roman" w:hAnsi="Times New Roman" w:cs="Times New Roman"/>
+          <w:lang w:val="fr-FR"/>
+        </w:rPr>
+        <w:t xml:space="preserve">Démontrer que les chaines de caractères sont </w:t>
+      </w:r>
+      <w:r>
+        <w:rPr>
+          <w:rFonts w:ascii="Times New Roman" w:hAnsi="Times New Roman" w:cs="Times New Roman"/>
+          <w:lang w:val="fr-FR"/>
+        </w:rPr>
+        <w:t>encryptées</w:t>
+      </w:r>
+      <w:r>
+        <w:rPr>
+          <w:rFonts w:ascii="Times New Roman" w:hAnsi="Times New Roman" w:cs="Times New Roman"/>
+          <w:lang w:val="fr-FR"/>
+        </w:rPr>
+        <w:t xml:space="preserve"> correctement</w:t>
+      </w:r>
+      <w:r>
+        <w:rPr>
+          <w:rFonts w:ascii="Times New Roman" w:hAnsi="Times New Roman" w:cs="Times New Roman"/>
+          <w:lang w:val="fr-FR"/>
+        </w:rPr>
+        <w:t>.</w:t>
+      </w:r>
+    </w:p>
+    <w:p>
+      <w:pPr>
+        <w:rPr>
+          <w:rFonts w:ascii="Times New Roman" w:hAnsi="Times New Roman" w:cs="Times New Roman"/>
+          <w:lang w:val="fr-FR"/>
+        </w:rPr>
+      </w:pPr>
+      <w:r>
+        <w:rPr>
+          <w:rFonts w:ascii="Times New Roman" w:hAnsi="Times New Roman" w:cs="Times New Roman"/>
+          <w:lang w:val="fr-FR"/>
+        </w:rPr>
+        <w:br w:type="page"/>
+      </w:r>
+    </w:p>
+    <w:p>
+      <w:pPr>
+        <w:rPr>
+          <w:rFonts w:ascii="Times New Roman" w:hAnsi="Times New Roman" w:cs="Times New Roman"/>
+          <w:b/>
+          <w:bCs/>
+          <w:sz w:val="26"/>
+          <w:szCs w:val="26"/>
+          <w:lang w:val="fr-FR"/>
+        </w:rPr>
+      </w:pPr>
+      <w:r>
+        <w:rPr>
+          <w:rFonts w:ascii="Times New Roman" w:hAnsi="Times New Roman" w:cs="Times New Roman"/>
+          <w:b/>
+          <w:bCs/>
+          <w:sz w:val="26"/>
+          <w:szCs w:val="26"/>
+          <w:lang w:val="fr-FR"/>
+        </w:rPr>
+        <w:lastRenderedPageBreak/>
+        <w:t>CU03 Décrypter à l’aide de la clé privée</w:t>
+      </w:r>
+    </w:p>
+    <w:p>
+      <w:pPr>
+        <w:rPr>
+          <w:rFonts w:ascii="Times New Roman" w:hAnsi="Times New Roman" w:cs="Times New Roman"/>
+          <w:lang w:val="fr-FR"/>
+        </w:rPr>
+      </w:pPr>
+      <w:r>
+        <w:rPr>
+          <w:rFonts w:ascii="Times New Roman" w:hAnsi="Times New Roman" w:cs="Times New Roman"/>
+          <w:b/>
+          <w:bCs/>
+          <w:lang w:val="fr-FR"/>
+        </w:rPr>
+        <w:t>Acteur principal :</w:t>
+      </w:r>
+      <w:r>
+        <w:rPr>
+          <w:rFonts w:ascii="Times New Roman" w:hAnsi="Times New Roman" w:cs="Times New Roman"/>
+          <w:lang w:val="fr-FR"/>
+        </w:rPr>
+        <w:t xml:space="preserve"> </w:t>
+      </w:r>
+      <w:r>
+        <w:rPr>
+          <w:rFonts w:ascii="Times New Roman" w:hAnsi="Times New Roman" w:cs="Times New Roman"/>
+          <w:lang w:val="fr-FR"/>
+        </w:rPr>
+        <w:t>Utilisateur récipient</w:t>
+      </w:r>
+    </w:p>
+    <w:p>
+      <w:pPr>
+        <w:rPr>
+          <w:rFonts w:ascii="Times New Roman" w:hAnsi="Times New Roman" w:cs="Times New Roman"/>
+          <w:b/>
+          <w:bCs/>
+          <w:lang w:val="fr-FR"/>
+        </w:rPr>
+      </w:pPr>
+      <w:r>
+        <w:rPr>
+          <w:rFonts w:ascii="Times New Roman" w:hAnsi="Times New Roman" w:cs="Times New Roman"/>
+          <w:b/>
+          <w:bCs/>
+          <w:lang w:val="fr-FR"/>
+        </w:rPr>
+        <w:t xml:space="preserve">Préconditions : </w:t>
+      </w:r>
+    </w:p>
+    <w:p>
+      <w:pPr>
+        <w:pStyle w:val="Paragraphedeliste"/>
+        <w:numPr>
+          <w:ilvl w:val="0"/>
+          <w:numId w:val="1"/>
+        </w:numPr>
+        <w:rPr>
+          <w:rFonts w:ascii="Times New Roman" w:hAnsi="Times New Roman" w:cs="Times New Roman"/>
+          <w:lang w:val="fr-FR"/>
+        </w:rPr>
+      </w:pPr>
+      <w:r>
+        <w:rPr>
+          <w:rFonts w:ascii="Times New Roman" w:hAnsi="Times New Roman" w:cs="Times New Roman"/>
+          <w:lang w:val="fr-FR"/>
+        </w:rPr>
+        <w:t xml:space="preserve">La clé </w:t>
+      </w:r>
+      <w:r>
+        <w:rPr>
+          <w:rFonts w:ascii="Times New Roman" w:hAnsi="Times New Roman" w:cs="Times New Roman"/>
+          <w:lang w:val="fr-FR"/>
+        </w:rPr>
+        <w:t>privée</w:t>
+      </w:r>
+      <w:r>
+        <w:rPr>
+          <w:rFonts w:ascii="Times New Roman" w:hAnsi="Times New Roman" w:cs="Times New Roman"/>
+          <w:lang w:val="fr-FR"/>
+        </w:rPr>
+        <w:t xml:space="preserve"> est générée.</w:t>
+      </w:r>
+    </w:p>
+    <w:p>
+      <w:pPr>
+        <w:rPr>
+          <w:rFonts w:ascii="Times New Roman" w:hAnsi="Times New Roman" w:cs="Times New Roman"/>
+          <w:b/>
+          <w:bCs/>
+          <w:lang w:val="fr-FR"/>
+        </w:rPr>
+      </w:pPr>
+      <w:r>
+        <w:rPr>
+          <w:rFonts w:ascii="Times New Roman" w:hAnsi="Times New Roman" w:cs="Times New Roman"/>
+          <w:b/>
+          <w:bCs/>
+          <w:lang w:val="fr-FR"/>
+        </w:rPr>
+        <w:t>Postconditions :</w:t>
+      </w:r>
+    </w:p>
+    <w:p>
+      <w:pPr>
+        <w:pStyle w:val="Paragraphedeliste"/>
+        <w:numPr>
+          <w:ilvl w:val="0"/>
+          <w:numId w:val="1"/>
+        </w:numPr>
+        <w:rPr>
+          <w:rFonts w:ascii="Times New Roman" w:hAnsi="Times New Roman" w:cs="Times New Roman"/>
+          <w:lang w:val="fr-FR"/>
+        </w:rPr>
+      </w:pPr>
+      <w:r>
+        <w:rPr>
+          <w:rFonts w:ascii="Times New Roman" w:hAnsi="Times New Roman" w:cs="Times New Roman"/>
+          <w:lang w:val="fr-FR"/>
+        </w:rPr>
+        <w:t xml:space="preserve">Le message a été </w:t>
+      </w:r>
+      <w:r>
+        <w:rPr>
+          <w:rFonts w:ascii="Times New Roman" w:hAnsi="Times New Roman" w:cs="Times New Roman"/>
+          <w:lang w:val="fr-FR"/>
+        </w:rPr>
+        <w:t>dé</w:t>
+      </w:r>
+      <w:r>
+        <w:rPr>
+          <w:rFonts w:ascii="Times New Roman" w:hAnsi="Times New Roman" w:cs="Times New Roman"/>
+          <w:lang w:val="fr-FR"/>
+        </w:rPr>
+        <w:t>crypté.</w:t>
+      </w:r>
+    </w:p>
+    <w:p>
+      <w:pPr>
+        <w:rPr>
+          <w:rFonts w:ascii="Times New Roman" w:hAnsi="Times New Roman" w:cs="Times New Roman"/>
+          <w:b/>
+          <w:bCs/>
+          <w:lang w:val="fr-FR"/>
+        </w:rPr>
+      </w:pPr>
+      <w:r>
+        <w:rPr>
+          <w:rFonts w:ascii="Times New Roman" w:hAnsi="Times New Roman" w:cs="Times New Roman"/>
+          <w:b/>
+          <w:bCs/>
+          <w:lang w:val="fr-FR"/>
+        </w:rPr>
+        <w:t xml:space="preserve">Scénario principal : </w:t>
+      </w:r>
+    </w:p>
+    <w:p>
+      <w:pPr>
+        <w:pStyle w:val="Paragraphedeliste"/>
+        <w:numPr>
+          <w:ilvl w:val="0"/>
+          <w:numId w:val="11"/>
+        </w:numPr>
+        <w:rPr>
+          <w:rFonts w:ascii="Times New Roman" w:hAnsi="Times New Roman" w:cs="Times New Roman"/>
+          <w:lang w:val="fr-FR"/>
+        </w:rPr>
+      </w:pPr>
+      <w:r>
+        <w:rPr>
+          <w:rFonts w:ascii="Times New Roman" w:hAnsi="Times New Roman" w:cs="Times New Roman"/>
+          <w:lang w:val="fr-FR"/>
+        </w:rPr>
+        <w:t>L’utilisateur invoque le programme en lui passant les arguments suivants en ordre :</w:t>
+      </w:r>
+    </w:p>
+    <w:p>
+      <w:pPr>
+        <w:pStyle w:val="Paragraphedeliste"/>
+        <w:numPr>
+          <w:ilvl w:val="0"/>
+          <w:numId w:val="13"/>
+        </w:numPr>
+        <w:rPr>
+          <w:rFonts w:ascii="Times New Roman" w:hAnsi="Times New Roman" w:cs="Times New Roman"/>
+          <w:lang w:val="fr-FR"/>
+        </w:rPr>
+      </w:pPr>
+      <w:r>
+        <w:rPr>
+          <w:rFonts w:ascii="Times New Roman" w:hAnsi="Times New Roman" w:cs="Times New Roman"/>
+          <w:lang w:val="fr-FR"/>
+        </w:rPr>
+        <w:t>La commande « </w:t>
+      </w:r>
+      <w:proofErr w:type="spellStart"/>
+      <w:r>
+        <w:rPr>
+          <w:rFonts w:ascii="Times New Roman" w:hAnsi="Times New Roman" w:cs="Times New Roman"/>
+          <w:lang w:val="fr-FR"/>
+        </w:rPr>
+        <w:t>decrypt</w:t>
+      </w:r>
+      <w:proofErr w:type="spellEnd"/>
+      <w:r>
+        <w:rPr>
+          <w:rFonts w:ascii="Times New Roman" w:hAnsi="Times New Roman" w:cs="Times New Roman"/>
+          <w:lang w:val="fr-FR"/>
+        </w:rPr>
+        <w:t> »</w:t>
+      </w:r>
+      <w:r>
+        <w:rPr>
+          <w:rFonts w:ascii="Times New Roman" w:hAnsi="Times New Roman" w:cs="Times New Roman"/>
+          <w:lang w:val="fr-FR"/>
+        </w:rPr>
+        <w:t>.</w:t>
+      </w:r>
+    </w:p>
+    <w:p>
+      <w:pPr>
+        <w:pStyle w:val="Paragraphedeliste"/>
+        <w:numPr>
+          <w:ilvl w:val="0"/>
+          <w:numId w:val="13"/>
+        </w:numPr>
+        <w:rPr>
+          <w:rFonts w:ascii="Times New Roman" w:hAnsi="Times New Roman" w:cs="Times New Roman"/>
+          <w:lang w:val="fr-FR"/>
+        </w:rPr>
+      </w:pPr>
+      <w:r>
+        <w:rPr>
+          <w:rFonts w:ascii="Times New Roman" w:hAnsi="Times New Roman" w:cs="Times New Roman"/>
+          <w:lang w:val="fr-FR"/>
+        </w:rPr>
+        <w:t>Le chemin local de la clé privée.</w:t>
+      </w:r>
+    </w:p>
+    <w:p>
+      <w:pPr>
+        <w:pStyle w:val="Paragraphedeliste"/>
+        <w:numPr>
+          <w:ilvl w:val="0"/>
+          <w:numId w:val="13"/>
+        </w:numPr>
+        <w:rPr>
+          <w:rFonts w:ascii="Times New Roman" w:hAnsi="Times New Roman" w:cs="Times New Roman"/>
+          <w:lang w:val="fr-FR"/>
+        </w:rPr>
+      </w:pPr>
+      <w:r>
+        <w:rPr>
+          <w:rFonts w:ascii="Times New Roman" w:hAnsi="Times New Roman" w:cs="Times New Roman"/>
+          <w:lang w:val="fr-FR"/>
+        </w:rPr>
+        <w:t xml:space="preserve">La chaine de caractères à </w:t>
+      </w:r>
+      <w:r>
+        <w:rPr>
+          <w:rFonts w:ascii="Times New Roman" w:hAnsi="Times New Roman" w:cs="Times New Roman"/>
+          <w:lang w:val="fr-FR"/>
+        </w:rPr>
+        <w:t>décrypter.</w:t>
+      </w:r>
+    </w:p>
+    <w:p>
+      <w:pPr>
+        <w:pStyle w:val="Paragraphedeliste"/>
+        <w:numPr>
+          <w:ilvl w:val="0"/>
+          <w:numId w:val="11"/>
+        </w:numPr>
+        <w:rPr>
+          <w:rFonts w:ascii="Times New Roman" w:hAnsi="Times New Roman" w:cs="Times New Roman"/>
+          <w:lang w:val="fr-FR"/>
+        </w:rPr>
+      </w:pPr>
+      <w:r>
+        <w:rPr>
+          <w:rFonts w:ascii="Times New Roman" w:hAnsi="Times New Roman" w:cs="Times New Roman"/>
+          <w:lang w:val="fr-FR"/>
+        </w:rPr>
+        <w:t xml:space="preserve">Le programme imprime la chaine de caractères </w:t>
+      </w:r>
+      <w:r>
+        <w:rPr>
+          <w:rFonts w:ascii="Times New Roman" w:hAnsi="Times New Roman" w:cs="Times New Roman"/>
+          <w:lang w:val="fr-FR"/>
+        </w:rPr>
+        <w:t>décryptée</w:t>
+      </w:r>
+      <w:r>
+        <w:rPr>
+          <w:rFonts w:ascii="Times New Roman" w:hAnsi="Times New Roman" w:cs="Times New Roman"/>
+          <w:lang w:val="fr-FR"/>
+        </w:rPr>
+        <w:t>.</w:t>
+      </w:r>
+    </w:p>
+    <w:p>
+      <w:pPr>
+        <w:rPr>
+          <w:rFonts w:ascii="Times New Roman" w:hAnsi="Times New Roman" w:cs="Times New Roman"/>
+          <w:b/>
+          <w:bCs/>
+          <w:lang w:val="fr-FR"/>
+        </w:rPr>
+      </w:pPr>
+      <w:r>
+        <w:rPr>
+          <w:rFonts w:ascii="Times New Roman" w:hAnsi="Times New Roman" w:cs="Times New Roman"/>
+          <w:b/>
+          <w:bCs/>
+          <w:lang w:val="fr-FR"/>
+        </w:rPr>
+        <w:t>Scénarios alternatifs :</w:t>
+      </w:r>
+    </w:p>
+    <w:p>
+      <w:pPr>
+        <w:rPr>
+          <w:rFonts w:ascii="Times New Roman" w:hAnsi="Times New Roman" w:cs="Times New Roman"/>
+          <w:lang w:val="fr-FR"/>
+        </w:rPr>
+      </w:pPr>
+      <w:r>
+        <w:rPr>
+          <w:rFonts w:ascii="Times New Roman" w:hAnsi="Times New Roman" w:cs="Times New Roman"/>
+          <w:lang w:val="fr-FR"/>
+        </w:rPr>
+        <w:tab/>
+        <w:t>-  Aucun scénario alternatif.</w:t>
+      </w:r>
+    </w:p>
+    <w:p>
+      <w:pPr>
+        <w:rPr>
+          <w:rFonts w:ascii="Times New Roman" w:hAnsi="Times New Roman" w:cs="Times New Roman"/>
+          <w:b/>
+          <w:bCs/>
+          <w:lang w:val="fr-FR"/>
+        </w:rPr>
+      </w:pPr>
+      <w:r>
+        <w:rPr>
+          <w:rFonts w:ascii="Times New Roman" w:hAnsi="Times New Roman" w:cs="Times New Roman"/>
+          <w:b/>
+          <w:bCs/>
+          <w:lang w:val="fr-FR"/>
+        </w:rPr>
+        <w:t>Tests supplémentaires :</w:t>
+      </w:r>
+    </w:p>
+    <w:p>
+      <w:pPr>
+        <w:pStyle w:val="Paragraphedeliste"/>
+        <w:numPr>
+          <w:ilvl w:val="0"/>
+          <w:numId w:val="14"/>
+        </w:numPr>
+        <w:rPr>
+          <w:rFonts w:ascii="Times New Roman" w:hAnsi="Times New Roman" w:cs="Times New Roman"/>
+          <w:lang w:val="fr-FR"/>
+        </w:rPr>
+      </w:pPr>
+      <w:r>
+        <w:rPr>
+          <w:rFonts w:ascii="Times New Roman" w:hAnsi="Times New Roman" w:cs="Times New Roman"/>
+          <w:lang w:val="fr-FR"/>
+        </w:rPr>
+        <w:t xml:space="preserve">Démontrer que les chaines de caractères sont </w:t>
+      </w:r>
+      <w:r>
+        <w:rPr>
+          <w:rFonts w:ascii="Times New Roman" w:hAnsi="Times New Roman" w:cs="Times New Roman"/>
+          <w:lang w:val="fr-FR"/>
+        </w:rPr>
+        <w:t>décryptées</w:t>
+      </w:r>
+      <w:r>
+        <w:rPr>
+          <w:rFonts w:ascii="Times New Roman" w:hAnsi="Times New Roman" w:cs="Times New Roman"/>
+          <w:lang w:val="fr-FR"/>
+        </w:rPr>
+        <w:t xml:space="preserve"> correctement.</w:t>
+      </w:r>
+    </w:p>
+    <w:p>
+      <w:pPr>
+        <w:rPr>
+          <w:rFonts w:ascii="Times New Roman" w:hAnsi="Times New Roman" w:cs="Times New Roman"/>
+          <w:lang w:val="fr-FR"/>
+        </w:rPr>
+      </w:pPr>
+    </w:p>
+    <w:p>
+      <w:pPr>
+        <w:rPr>
+          <w:rFonts w:ascii="Times New Roman" w:hAnsi="Times New Roman" w:cs="Times New Roman"/>
+          <w:lang w:val="fr-FR"/>
+        </w:rPr>
+      </w:pPr>
+    </w:p>
+    <w:p>
+      <w:pPr>
+        <w:rPr>
+          <w:rFonts w:ascii="Times New Roman" w:hAnsi="Times New Roman" w:cs="Times New Roman"/>
+          <w:lang w:val="fr-FR"/>
+        </w:rPr>
+      </w:pPr>
+    </w:p>
+    <w:p>
+      <w:pPr>
+        <w:rPr>
+          <w:rFonts w:ascii="Times New Roman" w:hAnsi="Times New Roman" w:cs="Times New Roman"/>
+          <w:lang w:val="fr-FR"/>
+        </w:rPr>
+      </w:pPr>
+    </w:p>
+    <w:p>
+      <w:pPr>
+        <w:rPr>
+          <w:rFonts w:ascii="Times New Roman" w:hAnsi="Times New Roman" w:cs="Times New Roman"/>
+          <w:lang w:val="fr-FR"/>
+        </w:rPr>
+      </w:pPr>
+    </w:p>
+    <w:p>
+      <w:pPr>
+        <w:rPr>
+          <w:rFonts w:ascii="Times New Roman" w:hAnsi="Times New Roman" w:cs="Times New Roman"/>
+          <w:lang w:val="fr-FR"/>
+        </w:rPr>
+      </w:pPr>
+    </w:p>
+    <w:p>
+      <w:pPr>
+        <w:rPr>
+          <w:rFonts w:ascii="Times New Roman" w:hAnsi="Times New Roman" w:cs="Times New Roman"/>
+          <w:lang w:val="fr-FR"/>
+        </w:rPr>
+      </w:pPr>
+    </w:p>
+    <w:p>
+      <w:pPr>
+        <w:rPr>
+          <w:rFonts w:ascii="Times New Roman" w:hAnsi="Times New Roman" w:cs="Times New Roman"/>
+          <w:lang w:val="fr-FR"/>
+        </w:rPr>
+      </w:pPr>
+    </w:p>
+    <w:p>
+      <w:pPr>
+        <w:rPr>
+          <w:rFonts w:ascii="Times New Roman" w:hAnsi="Times New Roman" w:cs="Times New Roman"/>
+          <w:lang w:val="fr-FR"/>
+        </w:rPr>
+      </w:pPr>
+    </w:p>
+    <w:p>
+      <w:pPr>
+        <w:rPr>
+          <w:rFonts w:ascii="Times New Roman" w:hAnsi="Times New Roman" w:cs="Times New Roman"/>
+          <w:lang w:val="fr-FR"/>
+        </w:rPr>
+      </w:pPr>
+    </w:p>
+    <w:p>
+      <w:pPr>
+        <w:rPr>
+          <w:rFonts w:ascii="Times New Roman" w:hAnsi="Times New Roman" w:cs="Times New Roman"/>
+          <w:lang w:val="fr-FR"/>
+        </w:rPr>
+      </w:pPr>
+    </w:p>
+    <w:p>
+      <w:pPr>
+        <w:rPr>
+          <w:rFonts w:ascii="Times New Roman" w:hAnsi="Times New Roman" w:cs="Times New Roman"/>
+          <w:lang w:val="fr-FR"/>
+        </w:rPr>
+      </w:pPr>
     </w:p>
     <w:sectPr>
       <w:pgSz w:w="12240" w:h="15840"/>
@@ -895,6 +1980,1322 @@
     </w:sectPr>
   </w:body>
 </w:document>
+</file>
+
+<file path=word/numbering.xml><?xml version="1.0" encoding="utf-8"?>
+<w:numbering xmlns:wpc="http://schemas.microsoft.com/office/word/2010/wordprocessingCanvas" xmlns:cx="http://schemas.microsoft.com/office/drawing/2014/chartex" xmlns:cx1="http://schemas.microsoft.com/office/drawing/2015/9/8/chartex" xmlns:cx2="http://schemas.microsoft.com/office/drawing/2015/10/21/chartex" xmlns:cx3="http://schemas.microsoft.com/office/drawing/2016/5/9/chartex" xmlns:cx4="http://schemas.microsoft.com/office/drawing/2016/5/10/chartex" xmlns:cx5="http://schemas.microsoft.com/office/drawing/2016/5/11/chartex" xmlns:cx6="http://schemas.microsoft.com/office/drawing/2016/5/12/chartex" xmlns:cx7="http://schemas.microsoft.com/office/drawing/2016/5/13/chartex" xmlns:cx8="http://schemas.microsoft.com/office/drawing/2016/5/14/chartex" xmlns:mc="http://schemas.openxmlformats.org/markup-compatibility/2006" xmlns:aink="http://schemas.microsoft.com/office/drawing/2016/ink" xmlns:am3d="http://schemas.microsoft.com/office/drawing/2017/model3d" xmlns:o="urn:schemas-microsoft-com:office:office" xmlns:oel="http://schemas.microsoft.com/office/2019/extlst" xmlns:r="http://schemas.openxmlformats.org/officeDocument/2006/relationships" xmlns:m="http://schemas.openxmlformats.org/officeDocument/2006/math" xmlns:v="urn:schemas-microsoft-com:vml" xmlns:wp14="http://schemas.microsoft.com/office/word/2010/wordprocessingDrawing" xmlns:wp="http://schemas.openxmlformats.org/drawingml/2006/wordprocessingDrawing" xmlns:w10="urn:schemas-microsoft-com:office:word" xmlns:w="http://schemas.openxmlformats.org/wordprocessingml/2006/main" xmlns:w14="http://schemas.microsoft.com/office/word/2010/wordml" xmlns:w15="http://schemas.microsoft.com/office/word/2012/wordml" xmlns:w16cex="http://schemas.microsoft.com/office/word/2018/wordml/cex" xmlns:w16cid="http://schemas.microsoft.com/office/word/2016/wordml/cid" xmlns:w16="http://schemas.microsoft.com/office/word/2018/wordml" xmlns:w16du="http://schemas.microsoft.com/office/word/2023/wordml/word16du" xmlns:w16sdtdh="http://schemas.microsoft.com/office/word/2020/wordml/sdtdatahash" xmlns:w16sdtfl="http://schemas.microsoft.com/office/word/2024/wordml/sdtformatlock" xmlns:w16se="http://schemas.microsoft.com/office/word/2015/wordml/symex" xmlns:wpg="http://schemas.microsoft.com/office/word/2010/wordprocessingGroup" xmlns:wpi="http://schemas.microsoft.com/office/word/2010/wordprocessingInk" xmlns:wne="http://schemas.microsoft.com/office/word/2006/wordml" xmlns:wps="http://schemas.microsoft.com/office/word/2010/wordprocessingShape" mc:Ignorable="w14 w15 w16se w16cid w16 w16cex w16sdtdh w16sdtfl w16du wp14">
+  <w:abstractNum w:abstractNumId="0" w15:restartNumberingAfterBreak="0">
+    <w:nsid w:val="06E76F28"/>
+    <w:multiLevelType w:val="hybridMultilevel"/>
+    <w:tmpl w:val="397809D6"/>
+    <w:lvl w:ilvl="0" w:tplc="0C0C000F">
+      <w:start w:val="1"/>
+      <w:numFmt w:val="decimal"/>
+      <w:lvlText w:val="%1."/>
+      <w:lvlJc w:val="left"/>
+      <w:pPr>
+        <w:ind w:left="720" w:hanging="360"/>
+      </w:pPr>
+      <w:rPr>
+        <w:rFonts w:hint="default"/>
+      </w:rPr>
+    </w:lvl>
+    <w:lvl w:ilvl="1" w:tplc="0C0C0019" w:tentative="1">
+      <w:start w:val="1"/>
+      <w:numFmt w:val="lowerLetter"/>
+      <w:lvlText w:val="%2."/>
+      <w:lvlJc w:val="left"/>
+      <w:pPr>
+        <w:ind w:left="1440" w:hanging="360"/>
+      </w:pPr>
+    </w:lvl>
+    <w:lvl w:ilvl="2" w:tplc="0C0C001B" w:tentative="1">
+      <w:start w:val="1"/>
+      <w:numFmt w:val="lowerRoman"/>
+      <w:lvlText w:val="%3."/>
+      <w:lvlJc w:val="right"/>
+      <w:pPr>
+        <w:ind w:left="2160" w:hanging="180"/>
+      </w:pPr>
+    </w:lvl>
+    <w:lvl w:ilvl="3" w:tplc="0C0C000F" w:tentative="1">
+      <w:start w:val="1"/>
+      <w:numFmt w:val="decimal"/>
+      <w:lvlText w:val="%4."/>
+      <w:lvlJc w:val="left"/>
+      <w:pPr>
+        <w:ind w:left="2880" w:hanging="360"/>
+      </w:pPr>
+    </w:lvl>
+    <w:lvl w:ilvl="4" w:tplc="0C0C0019" w:tentative="1">
+      <w:start w:val="1"/>
+      <w:numFmt w:val="lowerLetter"/>
+      <w:lvlText w:val="%5."/>
+      <w:lvlJc w:val="left"/>
+      <w:pPr>
+        <w:ind w:left="3600" w:hanging="360"/>
+      </w:pPr>
+    </w:lvl>
+    <w:lvl w:ilvl="5" w:tplc="0C0C001B" w:tentative="1">
+      <w:start w:val="1"/>
+      <w:numFmt w:val="lowerRoman"/>
+      <w:lvlText w:val="%6."/>
+      <w:lvlJc w:val="right"/>
+      <w:pPr>
+        <w:ind w:left="4320" w:hanging="180"/>
+      </w:pPr>
+    </w:lvl>
+    <w:lvl w:ilvl="6" w:tplc="0C0C000F" w:tentative="1">
+      <w:start w:val="1"/>
+      <w:numFmt w:val="decimal"/>
+      <w:lvlText w:val="%7."/>
+      <w:lvlJc w:val="left"/>
+      <w:pPr>
+        <w:ind w:left="5040" w:hanging="360"/>
+      </w:pPr>
+    </w:lvl>
+    <w:lvl w:ilvl="7" w:tplc="0C0C0019" w:tentative="1">
+      <w:start w:val="1"/>
+      <w:numFmt w:val="lowerLetter"/>
+      <w:lvlText w:val="%8."/>
+      <w:lvlJc w:val="left"/>
+      <w:pPr>
+        <w:ind w:left="5760" w:hanging="360"/>
+      </w:pPr>
+    </w:lvl>
+    <w:lvl w:ilvl="8" w:tplc="0C0C001B" w:tentative="1">
+      <w:start w:val="1"/>
+      <w:numFmt w:val="lowerRoman"/>
+      <w:lvlText w:val="%9."/>
+      <w:lvlJc w:val="right"/>
+      <w:pPr>
+        <w:ind w:left="6480" w:hanging="180"/>
+      </w:pPr>
+    </w:lvl>
+  </w:abstractNum>
+  <w:abstractNum w:abstractNumId="1" w15:restartNumberingAfterBreak="0">
+    <w:nsid w:val="07027784"/>
+    <w:multiLevelType w:val="hybridMultilevel"/>
+    <w:tmpl w:val="232C9A80"/>
+    <w:lvl w:ilvl="0" w:tplc="0C0C000F">
+      <w:start w:val="1"/>
+      <w:numFmt w:val="decimal"/>
+      <w:lvlText w:val="%1."/>
+      <w:lvlJc w:val="left"/>
+      <w:pPr>
+        <w:ind w:left="720" w:hanging="360"/>
+      </w:pPr>
+      <w:rPr>
+        <w:rFonts w:hint="default"/>
+      </w:rPr>
+    </w:lvl>
+    <w:lvl w:ilvl="1" w:tplc="0C0C0019">
+      <w:start w:val="1"/>
+      <w:numFmt w:val="lowerLetter"/>
+      <w:lvlText w:val="%2."/>
+      <w:lvlJc w:val="left"/>
+      <w:pPr>
+        <w:ind w:left="1440" w:hanging="360"/>
+      </w:pPr>
+    </w:lvl>
+    <w:lvl w:ilvl="2" w:tplc="0C0C001B" w:tentative="1">
+      <w:start w:val="1"/>
+      <w:numFmt w:val="lowerRoman"/>
+      <w:lvlText w:val="%3."/>
+      <w:lvlJc w:val="right"/>
+      <w:pPr>
+        <w:ind w:left="2160" w:hanging="180"/>
+      </w:pPr>
+    </w:lvl>
+    <w:lvl w:ilvl="3" w:tplc="0C0C000F" w:tentative="1">
+      <w:start w:val="1"/>
+      <w:numFmt w:val="decimal"/>
+      <w:lvlText w:val="%4."/>
+      <w:lvlJc w:val="left"/>
+      <w:pPr>
+        <w:ind w:left="2880" w:hanging="360"/>
+      </w:pPr>
+    </w:lvl>
+    <w:lvl w:ilvl="4" w:tplc="0C0C0019" w:tentative="1">
+      <w:start w:val="1"/>
+      <w:numFmt w:val="lowerLetter"/>
+      <w:lvlText w:val="%5."/>
+      <w:lvlJc w:val="left"/>
+      <w:pPr>
+        <w:ind w:left="3600" w:hanging="360"/>
+      </w:pPr>
+    </w:lvl>
+    <w:lvl w:ilvl="5" w:tplc="0C0C001B" w:tentative="1">
+      <w:start w:val="1"/>
+      <w:numFmt w:val="lowerRoman"/>
+      <w:lvlText w:val="%6."/>
+      <w:lvlJc w:val="right"/>
+      <w:pPr>
+        <w:ind w:left="4320" w:hanging="180"/>
+      </w:pPr>
+    </w:lvl>
+    <w:lvl w:ilvl="6" w:tplc="0C0C000F" w:tentative="1">
+      <w:start w:val="1"/>
+      <w:numFmt w:val="decimal"/>
+      <w:lvlText w:val="%7."/>
+      <w:lvlJc w:val="left"/>
+      <w:pPr>
+        <w:ind w:left="5040" w:hanging="360"/>
+      </w:pPr>
+    </w:lvl>
+    <w:lvl w:ilvl="7" w:tplc="0C0C0019" w:tentative="1">
+      <w:start w:val="1"/>
+      <w:numFmt w:val="lowerLetter"/>
+      <w:lvlText w:val="%8."/>
+      <w:lvlJc w:val="left"/>
+      <w:pPr>
+        <w:ind w:left="5760" w:hanging="360"/>
+      </w:pPr>
+    </w:lvl>
+    <w:lvl w:ilvl="8" w:tplc="0C0C001B" w:tentative="1">
+      <w:start w:val="1"/>
+      <w:numFmt w:val="lowerRoman"/>
+      <w:lvlText w:val="%9."/>
+      <w:lvlJc w:val="right"/>
+      <w:pPr>
+        <w:ind w:left="6480" w:hanging="180"/>
+      </w:pPr>
+    </w:lvl>
+  </w:abstractNum>
+  <w:abstractNum w:abstractNumId="2" w15:restartNumberingAfterBreak="0">
+    <w:nsid w:val="07EB680B"/>
+    <w:multiLevelType w:val="hybridMultilevel"/>
+    <w:tmpl w:val="C22477C4"/>
+    <w:lvl w:ilvl="0" w:tplc="0C0C000F">
+      <w:start w:val="1"/>
+      <w:numFmt w:val="decimal"/>
+      <w:lvlText w:val="%1."/>
+      <w:lvlJc w:val="left"/>
+      <w:pPr>
+        <w:ind w:left="720" w:hanging="360"/>
+      </w:pPr>
+      <w:rPr>
+        <w:rFonts w:hint="default"/>
+      </w:rPr>
+    </w:lvl>
+    <w:lvl w:ilvl="1" w:tplc="0C0C0019" w:tentative="1">
+      <w:start w:val="1"/>
+      <w:numFmt w:val="lowerLetter"/>
+      <w:lvlText w:val="%2."/>
+      <w:lvlJc w:val="left"/>
+      <w:pPr>
+        <w:ind w:left="1440" w:hanging="360"/>
+      </w:pPr>
+    </w:lvl>
+    <w:lvl w:ilvl="2" w:tplc="0C0C001B" w:tentative="1">
+      <w:start w:val="1"/>
+      <w:numFmt w:val="lowerRoman"/>
+      <w:lvlText w:val="%3."/>
+      <w:lvlJc w:val="right"/>
+      <w:pPr>
+        <w:ind w:left="2160" w:hanging="180"/>
+      </w:pPr>
+    </w:lvl>
+    <w:lvl w:ilvl="3" w:tplc="0C0C000F" w:tentative="1">
+      <w:start w:val="1"/>
+      <w:numFmt w:val="decimal"/>
+      <w:lvlText w:val="%4."/>
+      <w:lvlJc w:val="left"/>
+      <w:pPr>
+        <w:ind w:left="2880" w:hanging="360"/>
+      </w:pPr>
+    </w:lvl>
+    <w:lvl w:ilvl="4" w:tplc="0C0C0019" w:tentative="1">
+      <w:start w:val="1"/>
+      <w:numFmt w:val="lowerLetter"/>
+      <w:lvlText w:val="%5."/>
+      <w:lvlJc w:val="left"/>
+      <w:pPr>
+        <w:ind w:left="3600" w:hanging="360"/>
+      </w:pPr>
+    </w:lvl>
+    <w:lvl w:ilvl="5" w:tplc="0C0C001B" w:tentative="1">
+      <w:start w:val="1"/>
+      <w:numFmt w:val="lowerRoman"/>
+      <w:lvlText w:val="%6."/>
+      <w:lvlJc w:val="right"/>
+      <w:pPr>
+        <w:ind w:left="4320" w:hanging="180"/>
+      </w:pPr>
+    </w:lvl>
+    <w:lvl w:ilvl="6" w:tplc="0C0C000F" w:tentative="1">
+      <w:start w:val="1"/>
+      <w:numFmt w:val="decimal"/>
+      <w:lvlText w:val="%7."/>
+      <w:lvlJc w:val="left"/>
+      <w:pPr>
+        <w:ind w:left="5040" w:hanging="360"/>
+      </w:pPr>
+    </w:lvl>
+    <w:lvl w:ilvl="7" w:tplc="0C0C0019" w:tentative="1">
+      <w:start w:val="1"/>
+      <w:numFmt w:val="lowerLetter"/>
+      <w:lvlText w:val="%8."/>
+      <w:lvlJc w:val="left"/>
+      <w:pPr>
+        <w:ind w:left="5760" w:hanging="360"/>
+      </w:pPr>
+    </w:lvl>
+    <w:lvl w:ilvl="8" w:tplc="0C0C001B" w:tentative="1">
+      <w:start w:val="1"/>
+      <w:numFmt w:val="lowerRoman"/>
+      <w:lvlText w:val="%9."/>
+      <w:lvlJc w:val="right"/>
+      <w:pPr>
+        <w:ind w:left="6480" w:hanging="180"/>
+      </w:pPr>
+    </w:lvl>
+  </w:abstractNum>
+  <w:abstractNum w:abstractNumId="3" w15:restartNumberingAfterBreak="0">
+    <w:nsid w:val="10FE0111"/>
+    <w:multiLevelType w:val="hybridMultilevel"/>
+    <w:tmpl w:val="9BA8221C"/>
+    <w:lvl w:ilvl="0" w:tplc="C2501284">
+      <w:start w:val="1"/>
+      <w:numFmt w:val="decimal"/>
+      <w:lvlText w:val="%1."/>
+      <w:lvlJc w:val="left"/>
+      <w:pPr>
+        <w:ind w:left="1068" w:hanging="360"/>
+      </w:pPr>
+      <w:rPr>
+        <w:rFonts w:hint="default"/>
+      </w:rPr>
+    </w:lvl>
+    <w:lvl w:ilvl="1" w:tplc="0C0C0019" w:tentative="1">
+      <w:start w:val="1"/>
+      <w:numFmt w:val="lowerLetter"/>
+      <w:lvlText w:val="%2."/>
+      <w:lvlJc w:val="left"/>
+      <w:pPr>
+        <w:ind w:left="1788" w:hanging="360"/>
+      </w:pPr>
+    </w:lvl>
+    <w:lvl w:ilvl="2" w:tplc="0C0C001B" w:tentative="1">
+      <w:start w:val="1"/>
+      <w:numFmt w:val="lowerRoman"/>
+      <w:lvlText w:val="%3."/>
+      <w:lvlJc w:val="right"/>
+      <w:pPr>
+        <w:ind w:left="2508" w:hanging="180"/>
+      </w:pPr>
+    </w:lvl>
+    <w:lvl w:ilvl="3" w:tplc="0C0C000F" w:tentative="1">
+      <w:start w:val="1"/>
+      <w:numFmt w:val="decimal"/>
+      <w:lvlText w:val="%4."/>
+      <w:lvlJc w:val="left"/>
+      <w:pPr>
+        <w:ind w:left="3228" w:hanging="360"/>
+      </w:pPr>
+    </w:lvl>
+    <w:lvl w:ilvl="4" w:tplc="0C0C0019" w:tentative="1">
+      <w:start w:val="1"/>
+      <w:numFmt w:val="lowerLetter"/>
+      <w:lvlText w:val="%5."/>
+      <w:lvlJc w:val="left"/>
+      <w:pPr>
+        <w:ind w:left="3948" w:hanging="360"/>
+      </w:pPr>
+    </w:lvl>
+    <w:lvl w:ilvl="5" w:tplc="0C0C001B" w:tentative="1">
+      <w:start w:val="1"/>
+      <w:numFmt w:val="lowerRoman"/>
+      <w:lvlText w:val="%6."/>
+      <w:lvlJc w:val="right"/>
+      <w:pPr>
+        <w:ind w:left="4668" w:hanging="180"/>
+      </w:pPr>
+    </w:lvl>
+    <w:lvl w:ilvl="6" w:tplc="0C0C000F" w:tentative="1">
+      <w:start w:val="1"/>
+      <w:numFmt w:val="decimal"/>
+      <w:lvlText w:val="%7."/>
+      <w:lvlJc w:val="left"/>
+      <w:pPr>
+        <w:ind w:left="5388" w:hanging="360"/>
+      </w:pPr>
+    </w:lvl>
+    <w:lvl w:ilvl="7" w:tplc="0C0C0019" w:tentative="1">
+      <w:start w:val="1"/>
+      <w:numFmt w:val="lowerLetter"/>
+      <w:lvlText w:val="%8."/>
+      <w:lvlJc w:val="left"/>
+      <w:pPr>
+        <w:ind w:left="6108" w:hanging="360"/>
+      </w:pPr>
+    </w:lvl>
+    <w:lvl w:ilvl="8" w:tplc="0C0C001B" w:tentative="1">
+      <w:start w:val="1"/>
+      <w:numFmt w:val="lowerRoman"/>
+      <w:lvlText w:val="%9."/>
+      <w:lvlJc w:val="right"/>
+      <w:pPr>
+        <w:ind w:left="6828" w:hanging="180"/>
+      </w:pPr>
+    </w:lvl>
+  </w:abstractNum>
+  <w:abstractNum w:abstractNumId="4" w15:restartNumberingAfterBreak="0">
+    <w:nsid w:val="1B3A2D80"/>
+    <w:multiLevelType w:val="hybridMultilevel"/>
+    <w:tmpl w:val="0AE8AACE"/>
+    <w:lvl w:ilvl="0" w:tplc="80B0527E">
+      <w:start w:val="1"/>
+      <w:numFmt w:val="decimal"/>
+      <w:lvlText w:val="%1."/>
+      <w:lvlJc w:val="left"/>
+      <w:pPr>
+        <w:ind w:left="1068" w:hanging="360"/>
+      </w:pPr>
+      <w:rPr>
+        <w:rFonts w:hint="default"/>
+      </w:rPr>
+    </w:lvl>
+    <w:lvl w:ilvl="1" w:tplc="0C0C0019" w:tentative="1">
+      <w:start w:val="1"/>
+      <w:numFmt w:val="lowerLetter"/>
+      <w:lvlText w:val="%2."/>
+      <w:lvlJc w:val="left"/>
+      <w:pPr>
+        <w:ind w:left="1788" w:hanging="360"/>
+      </w:pPr>
+    </w:lvl>
+    <w:lvl w:ilvl="2" w:tplc="0C0C001B" w:tentative="1">
+      <w:start w:val="1"/>
+      <w:numFmt w:val="lowerRoman"/>
+      <w:lvlText w:val="%3."/>
+      <w:lvlJc w:val="right"/>
+      <w:pPr>
+        <w:ind w:left="2508" w:hanging="180"/>
+      </w:pPr>
+    </w:lvl>
+    <w:lvl w:ilvl="3" w:tplc="0C0C000F" w:tentative="1">
+      <w:start w:val="1"/>
+      <w:numFmt w:val="decimal"/>
+      <w:lvlText w:val="%4."/>
+      <w:lvlJc w:val="left"/>
+      <w:pPr>
+        <w:ind w:left="3228" w:hanging="360"/>
+      </w:pPr>
+    </w:lvl>
+    <w:lvl w:ilvl="4" w:tplc="0C0C0019" w:tentative="1">
+      <w:start w:val="1"/>
+      <w:numFmt w:val="lowerLetter"/>
+      <w:lvlText w:val="%5."/>
+      <w:lvlJc w:val="left"/>
+      <w:pPr>
+        <w:ind w:left="3948" w:hanging="360"/>
+      </w:pPr>
+    </w:lvl>
+    <w:lvl w:ilvl="5" w:tplc="0C0C001B" w:tentative="1">
+      <w:start w:val="1"/>
+      <w:numFmt w:val="lowerRoman"/>
+      <w:lvlText w:val="%6."/>
+      <w:lvlJc w:val="right"/>
+      <w:pPr>
+        <w:ind w:left="4668" w:hanging="180"/>
+      </w:pPr>
+    </w:lvl>
+    <w:lvl w:ilvl="6" w:tplc="0C0C000F" w:tentative="1">
+      <w:start w:val="1"/>
+      <w:numFmt w:val="decimal"/>
+      <w:lvlText w:val="%7."/>
+      <w:lvlJc w:val="left"/>
+      <w:pPr>
+        <w:ind w:left="5388" w:hanging="360"/>
+      </w:pPr>
+    </w:lvl>
+    <w:lvl w:ilvl="7" w:tplc="0C0C0019" w:tentative="1">
+      <w:start w:val="1"/>
+      <w:numFmt w:val="lowerLetter"/>
+      <w:lvlText w:val="%8."/>
+      <w:lvlJc w:val="left"/>
+      <w:pPr>
+        <w:ind w:left="6108" w:hanging="360"/>
+      </w:pPr>
+    </w:lvl>
+    <w:lvl w:ilvl="8" w:tplc="0C0C001B" w:tentative="1">
+      <w:start w:val="1"/>
+      <w:numFmt w:val="lowerRoman"/>
+      <w:lvlText w:val="%9."/>
+      <w:lvlJc w:val="right"/>
+      <w:pPr>
+        <w:ind w:left="6828" w:hanging="180"/>
+      </w:pPr>
+    </w:lvl>
+  </w:abstractNum>
+  <w:abstractNum w:abstractNumId="5" w15:restartNumberingAfterBreak="0">
+    <w:nsid w:val="3013797B"/>
+    <w:multiLevelType w:val="hybridMultilevel"/>
+    <w:tmpl w:val="37680612"/>
+    <w:lvl w:ilvl="0" w:tplc="67BE55A0">
+      <w:start w:val="1"/>
+      <w:numFmt w:val="lowerLetter"/>
+      <w:lvlText w:val="%1."/>
+      <w:lvlJc w:val="left"/>
+      <w:pPr>
+        <w:ind w:left="1080" w:hanging="360"/>
+      </w:pPr>
+      <w:rPr>
+        <w:rFonts w:hint="default"/>
+      </w:rPr>
+    </w:lvl>
+    <w:lvl w:ilvl="1" w:tplc="0C0C0019" w:tentative="1">
+      <w:start w:val="1"/>
+      <w:numFmt w:val="lowerLetter"/>
+      <w:lvlText w:val="%2."/>
+      <w:lvlJc w:val="left"/>
+      <w:pPr>
+        <w:ind w:left="1800" w:hanging="360"/>
+      </w:pPr>
+    </w:lvl>
+    <w:lvl w:ilvl="2" w:tplc="0C0C001B" w:tentative="1">
+      <w:start w:val="1"/>
+      <w:numFmt w:val="lowerRoman"/>
+      <w:lvlText w:val="%3."/>
+      <w:lvlJc w:val="right"/>
+      <w:pPr>
+        <w:ind w:left="2520" w:hanging="180"/>
+      </w:pPr>
+    </w:lvl>
+    <w:lvl w:ilvl="3" w:tplc="0C0C000F" w:tentative="1">
+      <w:start w:val="1"/>
+      <w:numFmt w:val="decimal"/>
+      <w:lvlText w:val="%4."/>
+      <w:lvlJc w:val="left"/>
+      <w:pPr>
+        <w:ind w:left="3240" w:hanging="360"/>
+      </w:pPr>
+    </w:lvl>
+    <w:lvl w:ilvl="4" w:tplc="0C0C0019" w:tentative="1">
+      <w:start w:val="1"/>
+      <w:numFmt w:val="lowerLetter"/>
+      <w:lvlText w:val="%5."/>
+      <w:lvlJc w:val="left"/>
+      <w:pPr>
+        <w:ind w:left="3960" w:hanging="360"/>
+      </w:pPr>
+    </w:lvl>
+    <w:lvl w:ilvl="5" w:tplc="0C0C001B" w:tentative="1">
+      <w:start w:val="1"/>
+      <w:numFmt w:val="lowerRoman"/>
+      <w:lvlText w:val="%6."/>
+      <w:lvlJc w:val="right"/>
+      <w:pPr>
+        <w:ind w:left="4680" w:hanging="180"/>
+      </w:pPr>
+    </w:lvl>
+    <w:lvl w:ilvl="6" w:tplc="0C0C000F" w:tentative="1">
+      <w:start w:val="1"/>
+      <w:numFmt w:val="decimal"/>
+      <w:lvlText w:val="%7."/>
+      <w:lvlJc w:val="left"/>
+      <w:pPr>
+        <w:ind w:left="5400" w:hanging="360"/>
+      </w:pPr>
+    </w:lvl>
+    <w:lvl w:ilvl="7" w:tplc="0C0C0019" w:tentative="1">
+      <w:start w:val="1"/>
+      <w:numFmt w:val="lowerLetter"/>
+      <w:lvlText w:val="%8."/>
+      <w:lvlJc w:val="left"/>
+      <w:pPr>
+        <w:ind w:left="6120" w:hanging="360"/>
+      </w:pPr>
+    </w:lvl>
+    <w:lvl w:ilvl="8" w:tplc="0C0C001B" w:tentative="1">
+      <w:start w:val="1"/>
+      <w:numFmt w:val="lowerRoman"/>
+      <w:lvlText w:val="%9."/>
+      <w:lvlJc w:val="right"/>
+      <w:pPr>
+        <w:ind w:left="6840" w:hanging="180"/>
+      </w:pPr>
+    </w:lvl>
+  </w:abstractNum>
+  <w:abstractNum w:abstractNumId="6" w15:restartNumberingAfterBreak="0">
+    <w:nsid w:val="359B3EB4"/>
+    <w:multiLevelType w:val="hybridMultilevel"/>
+    <w:tmpl w:val="F8BC0070"/>
+    <w:lvl w:ilvl="0" w:tplc="F370C49A">
+      <w:start w:val="1"/>
+      <w:numFmt w:val="decimal"/>
+      <w:lvlText w:val="%1."/>
+      <w:lvlJc w:val="left"/>
+      <w:pPr>
+        <w:ind w:left="1776" w:hanging="360"/>
+      </w:pPr>
+      <w:rPr>
+        <w:rFonts w:hint="default"/>
+      </w:rPr>
+    </w:lvl>
+    <w:lvl w:ilvl="1" w:tplc="0C0C0019" w:tentative="1">
+      <w:start w:val="1"/>
+      <w:numFmt w:val="lowerLetter"/>
+      <w:lvlText w:val="%2."/>
+      <w:lvlJc w:val="left"/>
+      <w:pPr>
+        <w:ind w:left="2496" w:hanging="360"/>
+      </w:pPr>
+    </w:lvl>
+    <w:lvl w:ilvl="2" w:tplc="0C0C001B" w:tentative="1">
+      <w:start w:val="1"/>
+      <w:numFmt w:val="lowerRoman"/>
+      <w:lvlText w:val="%3."/>
+      <w:lvlJc w:val="right"/>
+      <w:pPr>
+        <w:ind w:left="3216" w:hanging="180"/>
+      </w:pPr>
+    </w:lvl>
+    <w:lvl w:ilvl="3" w:tplc="0C0C000F" w:tentative="1">
+      <w:start w:val="1"/>
+      <w:numFmt w:val="decimal"/>
+      <w:lvlText w:val="%4."/>
+      <w:lvlJc w:val="left"/>
+      <w:pPr>
+        <w:ind w:left="3936" w:hanging="360"/>
+      </w:pPr>
+    </w:lvl>
+    <w:lvl w:ilvl="4" w:tplc="0C0C0019" w:tentative="1">
+      <w:start w:val="1"/>
+      <w:numFmt w:val="lowerLetter"/>
+      <w:lvlText w:val="%5."/>
+      <w:lvlJc w:val="left"/>
+      <w:pPr>
+        <w:ind w:left="4656" w:hanging="360"/>
+      </w:pPr>
+    </w:lvl>
+    <w:lvl w:ilvl="5" w:tplc="0C0C001B" w:tentative="1">
+      <w:start w:val="1"/>
+      <w:numFmt w:val="lowerRoman"/>
+      <w:lvlText w:val="%6."/>
+      <w:lvlJc w:val="right"/>
+      <w:pPr>
+        <w:ind w:left="5376" w:hanging="180"/>
+      </w:pPr>
+    </w:lvl>
+    <w:lvl w:ilvl="6" w:tplc="0C0C000F" w:tentative="1">
+      <w:start w:val="1"/>
+      <w:numFmt w:val="decimal"/>
+      <w:lvlText w:val="%7."/>
+      <w:lvlJc w:val="left"/>
+      <w:pPr>
+        <w:ind w:left="6096" w:hanging="360"/>
+      </w:pPr>
+    </w:lvl>
+    <w:lvl w:ilvl="7" w:tplc="0C0C0019" w:tentative="1">
+      <w:start w:val="1"/>
+      <w:numFmt w:val="lowerLetter"/>
+      <w:lvlText w:val="%8."/>
+      <w:lvlJc w:val="left"/>
+      <w:pPr>
+        <w:ind w:left="6816" w:hanging="360"/>
+      </w:pPr>
+    </w:lvl>
+    <w:lvl w:ilvl="8" w:tplc="0C0C001B" w:tentative="1">
+      <w:start w:val="1"/>
+      <w:numFmt w:val="lowerRoman"/>
+      <w:lvlText w:val="%9."/>
+      <w:lvlJc w:val="right"/>
+      <w:pPr>
+        <w:ind w:left="7536" w:hanging="180"/>
+      </w:pPr>
+    </w:lvl>
+  </w:abstractNum>
+  <w:abstractNum w:abstractNumId="7" w15:restartNumberingAfterBreak="0">
+    <w:nsid w:val="3B137806"/>
+    <w:multiLevelType w:val="hybridMultilevel"/>
+    <w:tmpl w:val="4A58810E"/>
+    <w:lvl w:ilvl="0" w:tplc="36B08A26">
+      <w:start w:val="1"/>
+      <w:numFmt w:val="upperLetter"/>
+      <w:lvlText w:val="%1."/>
+      <w:lvlJc w:val="left"/>
+      <w:pPr>
+        <w:ind w:left="1080" w:hanging="360"/>
+      </w:pPr>
+      <w:rPr>
+        <w:rFonts w:hint="default"/>
+      </w:rPr>
+    </w:lvl>
+    <w:lvl w:ilvl="1" w:tplc="0C0C0019" w:tentative="1">
+      <w:start w:val="1"/>
+      <w:numFmt w:val="lowerLetter"/>
+      <w:lvlText w:val="%2."/>
+      <w:lvlJc w:val="left"/>
+      <w:pPr>
+        <w:ind w:left="1800" w:hanging="360"/>
+      </w:pPr>
+    </w:lvl>
+    <w:lvl w:ilvl="2" w:tplc="0C0C001B" w:tentative="1">
+      <w:start w:val="1"/>
+      <w:numFmt w:val="lowerRoman"/>
+      <w:lvlText w:val="%3."/>
+      <w:lvlJc w:val="right"/>
+      <w:pPr>
+        <w:ind w:left="2520" w:hanging="180"/>
+      </w:pPr>
+    </w:lvl>
+    <w:lvl w:ilvl="3" w:tplc="0C0C000F" w:tentative="1">
+      <w:start w:val="1"/>
+      <w:numFmt w:val="decimal"/>
+      <w:lvlText w:val="%4."/>
+      <w:lvlJc w:val="left"/>
+      <w:pPr>
+        <w:ind w:left="3240" w:hanging="360"/>
+      </w:pPr>
+    </w:lvl>
+    <w:lvl w:ilvl="4" w:tplc="0C0C0019" w:tentative="1">
+      <w:start w:val="1"/>
+      <w:numFmt w:val="lowerLetter"/>
+      <w:lvlText w:val="%5."/>
+      <w:lvlJc w:val="left"/>
+      <w:pPr>
+        <w:ind w:left="3960" w:hanging="360"/>
+      </w:pPr>
+    </w:lvl>
+    <w:lvl w:ilvl="5" w:tplc="0C0C001B" w:tentative="1">
+      <w:start w:val="1"/>
+      <w:numFmt w:val="lowerRoman"/>
+      <w:lvlText w:val="%6."/>
+      <w:lvlJc w:val="right"/>
+      <w:pPr>
+        <w:ind w:left="4680" w:hanging="180"/>
+      </w:pPr>
+    </w:lvl>
+    <w:lvl w:ilvl="6" w:tplc="0C0C000F" w:tentative="1">
+      <w:start w:val="1"/>
+      <w:numFmt w:val="decimal"/>
+      <w:lvlText w:val="%7."/>
+      <w:lvlJc w:val="left"/>
+      <w:pPr>
+        <w:ind w:left="5400" w:hanging="360"/>
+      </w:pPr>
+    </w:lvl>
+    <w:lvl w:ilvl="7" w:tplc="0C0C0019" w:tentative="1">
+      <w:start w:val="1"/>
+      <w:numFmt w:val="lowerLetter"/>
+      <w:lvlText w:val="%8."/>
+      <w:lvlJc w:val="left"/>
+      <w:pPr>
+        <w:ind w:left="6120" w:hanging="360"/>
+      </w:pPr>
+    </w:lvl>
+    <w:lvl w:ilvl="8" w:tplc="0C0C001B" w:tentative="1">
+      <w:start w:val="1"/>
+      <w:numFmt w:val="lowerRoman"/>
+      <w:lvlText w:val="%9."/>
+      <w:lvlJc w:val="right"/>
+      <w:pPr>
+        <w:ind w:left="6840" w:hanging="180"/>
+      </w:pPr>
+    </w:lvl>
+  </w:abstractNum>
+  <w:abstractNum w:abstractNumId="8" w15:restartNumberingAfterBreak="0">
+    <w:nsid w:val="3B224139"/>
+    <w:multiLevelType w:val="hybridMultilevel"/>
+    <w:tmpl w:val="38A45A08"/>
+    <w:lvl w:ilvl="0" w:tplc="B3868DE6">
+      <w:start w:val="1"/>
+      <w:numFmt w:val="decimal"/>
+      <w:lvlText w:val="%1."/>
+      <w:lvlJc w:val="left"/>
+      <w:pPr>
+        <w:ind w:left="1068" w:hanging="360"/>
+      </w:pPr>
+      <w:rPr>
+        <w:rFonts w:hint="default"/>
+      </w:rPr>
+    </w:lvl>
+    <w:lvl w:ilvl="1" w:tplc="0C0C0019" w:tentative="1">
+      <w:start w:val="1"/>
+      <w:numFmt w:val="lowerLetter"/>
+      <w:lvlText w:val="%2."/>
+      <w:lvlJc w:val="left"/>
+      <w:pPr>
+        <w:ind w:left="1788" w:hanging="360"/>
+      </w:pPr>
+    </w:lvl>
+    <w:lvl w:ilvl="2" w:tplc="0C0C001B" w:tentative="1">
+      <w:start w:val="1"/>
+      <w:numFmt w:val="lowerRoman"/>
+      <w:lvlText w:val="%3."/>
+      <w:lvlJc w:val="right"/>
+      <w:pPr>
+        <w:ind w:left="2508" w:hanging="180"/>
+      </w:pPr>
+    </w:lvl>
+    <w:lvl w:ilvl="3" w:tplc="0C0C000F" w:tentative="1">
+      <w:start w:val="1"/>
+      <w:numFmt w:val="decimal"/>
+      <w:lvlText w:val="%4."/>
+      <w:lvlJc w:val="left"/>
+      <w:pPr>
+        <w:ind w:left="3228" w:hanging="360"/>
+      </w:pPr>
+    </w:lvl>
+    <w:lvl w:ilvl="4" w:tplc="0C0C0019" w:tentative="1">
+      <w:start w:val="1"/>
+      <w:numFmt w:val="lowerLetter"/>
+      <w:lvlText w:val="%5."/>
+      <w:lvlJc w:val="left"/>
+      <w:pPr>
+        <w:ind w:left="3948" w:hanging="360"/>
+      </w:pPr>
+    </w:lvl>
+    <w:lvl w:ilvl="5" w:tplc="0C0C001B" w:tentative="1">
+      <w:start w:val="1"/>
+      <w:numFmt w:val="lowerRoman"/>
+      <w:lvlText w:val="%6."/>
+      <w:lvlJc w:val="right"/>
+      <w:pPr>
+        <w:ind w:left="4668" w:hanging="180"/>
+      </w:pPr>
+    </w:lvl>
+    <w:lvl w:ilvl="6" w:tplc="0C0C000F" w:tentative="1">
+      <w:start w:val="1"/>
+      <w:numFmt w:val="decimal"/>
+      <w:lvlText w:val="%7."/>
+      <w:lvlJc w:val="left"/>
+      <w:pPr>
+        <w:ind w:left="5388" w:hanging="360"/>
+      </w:pPr>
+    </w:lvl>
+    <w:lvl w:ilvl="7" w:tplc="0C0C0019" w:tentative="1">
+      <w:start w:val="1"/>
+      <w:numFmt w:val="lowerLetter"/>
+      <w:lvlText w:val="%8."/>
+      <w:lvlJc w:val="left"/>
+      <w:pPr>
+        <w:ind w:left="6108" w:hanging="360"/>
+      </w:pPr>
+    </w:lvl>
+    <w:lvl w:ilvl="8" w:tplc="0C0C001B" w:tentative="1">
+      <w:start w:val="1"/>
+      <w:numFmt w:val="lowerRoman"/>
+      <w:lvlText w:val="%9."/>
+      <w:lvlJc w:val="right"/>
+      <w:pPr>
+        <w:ind w:left="6828" w:hanging="180"/>
+      </w:pPr>
+    </w:lvl>
+  </w:abstractNum>
+  <w:abstractNum w:abstractNumId="9" w15:restartNumberingAfterBreak="0">
+    <w:nsid w:val="3DE425FD"/>
+    <w:multiLevelType w:val="hybridMultilevel"/>
+    <w:tmpl w:val="7BC49D04"/>
+    <w:lvl w:ilvl="0" w:tplc="8DCC458C">
+      <w:start w:val="1"/>
+      <w:numFmt w:val="decimal"/>
+      <w:lvlText w:val="%1."/>
+      <w:lvlJc w:val="left"/>
+      <w:pPr>
+        <w:ind w:left="1776" w:hanging="360"/>
+      </w:pPr>
+      <w:rPr>
+        <w:rFonts w:hint="default"/>
+      </w:rPr>
+    </w:lvl>
+    <w:lvl w:ilvl="1" w:tplc="0C0C0019" w:tentative="1">
+      <w:start w:val="1"/>
+      <w:numFmt w:val="lowerLetter"/>
+      <w:lvlText w:val="%2."/>
+      <w:lvlJc w:val="left"/>
+      <w:pPr>
+        <w:ind w:left="2496" w:hanging="360"/>
+      </w:pPr>
+    </w:lvl>
+    <w:lvl w:ilvl="2" w:tplc="0C0C001B" w:tentative="1">
+      <w:start w:val="1"/>
+      <w:numFmt w:val="lowerRoman"/>
+      <w:lvlText w:val="%3."/>
+      <w:lvlJc w:val="right"/>
+      <w:pPr>
+        <w:ind w:left="3216" w:hanging="180"/>
+      </w:pPr>
+    </w:lvl>
+    <w:lvl w:ilvl="3" w:tplc="0C0C000F" w:tentative="1">
+      <w:start w:val="1"/>
+      <w:numFmt w:val="decimal"/>
+      <w:lvlText w:val="%4."/>
+      <w:lvlJc w:val="left"/>
+      <w:pPr>
+        <w:ind w:left="3936" w:hanging="360"/>
+      </w:pPr>
+    </w:lvl>
+    <w:lvl w:ilvl="4" w:tplc="0C0C0019" w:tentative="1">
+      <w:start w:val="1"/>
+      <w:numFmt w:val="lowerLetter"/>
+      <w:lvlText w:val="%5."/>
+      <w:lvlJc w:val="left"/>
+      <w:pPr>
+        <w:ind w:left="4656" w:hanging="360"/>
+      </w:pPr>
+    </w:lvl>
+    <w:lvl w:ilvl="5" w:tplc="0C0C001B" w:tentative="1">
+      <w:start w:val="1"/>
+      <w:numFmt w:val="lowerRoman"/>
+      <w:lvlText w:val="%6."/>
+      <w:lvlJc w:val="right"/>
+      <w:pPr>
+        <w:ind w:left="5376" w:hanging="180"/>
+      </w:pPr>
+    </w:lvl>
+    <w:lvl w:ilvl="6" w:tplc="0C0C000F" w:tentative="1">
+      <w:start w:val="1"/>
+      <w:numFmt w:val="decimal"/>
+      <w:lvlText w:val="%7."/>
+      <w:lvlJc w:val="left"/>
+      <w:pPr>
+        <w:ind w:left="6096" w:hanging="360"/>
+      </w:pPr>
+    </w:lvl>
+    <w:lvl w:ilvl="7" w:tplc="0C0C0019" w:tentative="1">
+      <w:start w:val="1"/>
+      <w:numFmt w:val="lowerLetter"/>
+      <w:lvlText w:val="%8."/>
+      <w:lvlJc w:val="left"/>
+      <w:pPr>
+        <w:ind w:left="6816" w:hanging="360"/>
+      </w:pPr>
+    </w:lvl>
+    <w:lvl w:ilvl="8" w:tplc="0C0C001B" w:tentative="1">
+      <w:start w:val="1"/>
+      <w:numFmt w:val="lowerRoman"/>
+      <w:lvlText w:val="%9."/>
+      <w:lvlJc w:val="right"/>
+      <w:pPr>
+        <w:ind w:left="7536" w:hanging="180"/>
+      </w:pPr>
+    </w:lvl>
+  </w:abstractNum>
+  <w:abstractNum w:abstractNumId="10" w15:restartNumberingAfterBreak="0">
+    <w:nsid w:val="52C75AD2"/>
+    <w:multiLevelType w:val="hybridMultilevel"/>
+    <w:tmpl w:val="C0CE21D2"/>
+    <w:lvl w:ilvl="0" w:tplc="0C0C000F">
+      <w:start w:val="1"/>
+      <w:numFmt w:val="decimal"/>
+      <w:lvlText w:val="%1."/>
+      <w:lvlJc w:val="left"/>
+      <w:pPr>
+        <w:ind w:left="720" w:hanging="360"/>
+      </w:pPr>
+      <w:rPr>
+        <w:rFonts w:hint="default"/>
+      </w:rPr>
+    </w:lvl>
+    <w:lvl w:ilvl="1" w:tplc="0C0C0019" w:tentative="1">
+      <w:start w:val="1"/>
+      <w:numFmt w:val="lowerLetter"/>
+      <w:lvlText w:val="%2."/>
+      <w:lvlJc w:val="left"/>
+      <w:pPr>
+        <w:ind w:left="1440" w:hanging="360"/>
+      </w:pPr>
+    </w:lvl>
+    <w:lvl w:ilvl="2" w:tplc="0C0C001B" w:tentative="1">
+      <w:start w:val="1"/>
+      <w:numFmt w:val="lowerRoman"/>
+      <w:lvlText w:val="%3."/>
+      <w:lvlJc w:val="right"/>
+      <w:pPr>
+        <w:ind w:left="2160" w:hanging="180"/>
+      </w:pPr>
+    </w:lvl>
+    <w:lvl w:ilvl="3" w:tplc="0C0C000F" w:tentative="1">
+      <w:start w:val="1"/>
+      <w:numFmt w:val="decimal"/>
+      <w:lvlText w:val="%4."/>
+      <w:lvlJc w:val="left"/>
+      <w:pPr>
+        <w:ind w:left="2880" w:hanging="360"/>
+      </w:pPr>
+    </w:lvl>
+    <w:lvl w:ilvl="4" w:tplc="0C0C0019" w:tentative="1">
+      <w:start w:val="1"/>
+      <w:numFmt w:val="lowerLetter"/>
+      <w:lvlText w:val="%5."/>
+      <w:lvlJc w:val="left"/>
+      <w:pPr>
+        <w:ind w:left="3600" w:hanging="360"/>
+      </w:pPr>
+    </w:lvl>
+    <w:lvl w:ilvl="5" w:tplc="0C0C001B" w:tentative="1">
+      <w:start w:val="1"/>
+      <w:numFmt w:val="lowerRoman"/>
+      <w:lvlText w:val="%6."/>
+      <w:lvlJc w:val="right"/>
+      <w:pPr>
+        <w:ind w:left="4320" w:hanging="180"/>
+      </w:pPr>
+    </w:lvl>
+    <w:lvl w:ilvl="6" w:tplc="0C0C000F" w:tentative="1">
+      <w:start w:val="1"/>
+      <w:numFmt w:val="decimal"/>
+      <w:lvlText w:val="%7."/>
+      <w:lvlJc w:val="left"/>
+      <w:pPr>
+        <w:ind w:left="5040" w:hanging="360"/>
+      </w:pPr>
+    </w:lvl>
+    <w:lvl w:ilvl="7" w:tplc="0C0C0019" w:tentative="1">
+      <w:start w:val="1"/>
+      <w:numFmt w:val="lowerLetter"/>
+      <w:lvlText w:val="%8."/>
+      <w:lvlJc w:val="left"/>
+      <w:pPr>
+        <w:ind w:left="5760" w:hanging="360"/>
+      </w:pPr>
+    </w:lvl>
+    <w:lvl w:ilvl="8" w:tplc="0C0C001B" w:tentative="1">
+      <w:start w:val="1"/>
+      <w:numFmt w:val="lowerRoman"/>
+      <w:lvlText w:val="%9."/>
+      <w:lvlJc w:val="right"/>
+      <w:pPr>
+        <w:ind w:left="6480" w:hanging="180"/>
+      </w:pPr>
+    </w:lvl>
+  </w:abstractNum>
+  <w:abstractNum w:abstractNumId="11" w15:restartNumberingAfterBreak="0">
+    <w:nsid w:val="611D504F"/>
+    <w:multiLevelType w:val="hybridMultilevel"/>
+    <w:tmpl w:val="397809D6"/>
+    <w:lvl w:ilvl="0" w:tplc="FFFFFFFF">
+      <w:start w:val="1"/>
+      <w:numFmt w:val="decimal"/>
+      <w:lvlText w:val="%1."/>
+      <w:lvlJc w:val="left"/>
+      <w:pPr>
+        <w:ind w:left="720" w:hanging="360"/>
+      </w:pPr>
+      <w:rPr>
+        <w:rFonts w:hint="default"/>
+      </w:rPr>
+    </w:lvl>
+    <w:lvl w:ilvl="1" w:tplc="FFFFFFFF" w:tentative="1">
+      <w:start w:val="1"/>
+      <w:numFmt w:val="lowerLetter"/>
+      <w:lvlText w:val="%2."/>
+      <w:lvlJc w:val="left"/>
+      <w:pPr>
+        <w:ind w:left="1440" w:hanging="360"/>
+      </w:pPr>
+    </w:lvl>
+    <w:lvl w:ilvl="2" w:tplc="FFFFFFFF" w:tentative="1">
+      <w:start w:val="1"/>
+      <w:numFmt w:val="lowerRoman"/>
+      <w:lvlText w:val="%3."/>
+      <w:lvlJc w:val="right"/>
+      <w:pPr>
+        <w:ind w:left="2160" w:hanging="180"/>
+      </w:pPr>
+    </w:lvl>
+    <w:lvl w:ilvl="3" w:tplc="FFFFFFFF" w:tentative="1">
+      <w:start w:val="1"/>
+      <w:numFmt w:val="decimal"/>
+      <w:lvlText w:val="%4."/>
+      <w:lvlJc w:val="left"/>
+      <w:pPr>
+        <w:ind w:left="2880" w:hanging="360"/>
+      </w:pPr>
+    </w:lvl>
+    <w:lvl w:ilvl="4" w:tplc="FFFFFFFF" w:tentative="1">
+      <w:start w:val="1"/>
+      <w:numFmt w:val="lowerLetter"/>
+      <w:lvlText w:val="%5."/>
+      <w:lvlJc w:val="left"/>
+      <w:pPr>
+        <w:ind w:left="3600" w:hanging="360"/>
+      </w:pPr>
+    </w:lvl>
+    <w:lvl w:ilvl="5" w:tplc="FFFFFFFF" w:tentative="1">
+      <w:start w:val="1"/>
+      <w:numFmt w:val="lowerRoman"/>
+      <w:lvlText w:val="%6."/>
+      <w:lvlJc w:val="right"/>
+      <w:pPr>
+        <w:ind w:left="4320" w:hanging="180"/>
+      </w:pPr>
+    </w:lvl>
+    <w:lvl w:ilvl="6" w:tplc="FFFFFFFF" w:tentative="1">
+      <w:start w:val="1"/>
+      <w:numFmt w:val="decimal"/>
+      <w:lvlText w:val="%7."/>
+      <w:lvlJc w:val="left"/>
+      <w:pPr>
+        <w:ind w:left="5040" w:hanging="360"/>
+      </w:pPr>
+    </w:lvl>
+    <w:lvl w:ilvl="7" w:tplc="FFFFFFFF" w:tentative="1">
+      <w:start w:val="1"/>
+      <w:numFmt w:val="lowerLetter"/>
+      <w:lvlText w:val="%8."/>
+      <w:lvlJc w:val="left"/>
+      <w:pPr>
+        <w:ind w:left="5760" w:hanging="360"/>
+      </w:pPr>
+    </w:lvl>
+    <w:lvl w:ilvl="8" w:tplc="FFFFFFFF" w:tentative="1">
+      <w:start w:val="1"/>
+      <w:numFmt w:val="lowerRoman"/>
+      <w:lvlText w:val="%9."/>
+      <w:lvlJc w:val="right"/>
+      <w:pPr>
+        <w:ind w:left="6480" w:hanging="180"/>
+      </w:pPr>
+    </w:lvl>
+  </w:abstractNum>
+  <w:abstractNum w:abstractNumId="12" w15:restartNumberingAfterBreak="0">
+    <w:nsid w:val="663434DE"/>
+    <w:multiLevelType w:val="hybridMultilevel"/>
+    <w:tmpl w:val="ED78C278"/>
+    <w:lvl w:ilvl="0" w:tplc="0C0C0019">
+      <w:start w:val="1"/>
+      <w:numFmt w:val="lowerLetter"/>
+      <w:lvlText w:val="%1."/>
+      <w:lvlJc w:val="left"/>
+      <w:pPr>
+        <w:ind w:left="1068" w:hanging="360"/>
+      </w:pPr>
+      <w:rPr>
+        <w:rFonts w:hint="default"/>
+      </w:rPr>
+    </w:lvl>
+    <w:lvl w:ilvl="1" w:tplc="0C0C0019" w:tentative="1">
+      <w:start w:val="1"/>
+      <w:numFmt w:val="lowerLetter"/>
+      <w:lvlText w:val="%2."/>
+      <w:lvlJc w:val="left"/>
+      <w:pPr>
+        <w:ind w:left="1788" w:hanging="360"/>
+      </w:pPr>
+    </w:lvl>
+    <w:lvl w:ilvl="2" w:tplc="0C0C001B" w:tentative="1">
+      <w:start w:val="1"/>
+      <w:numFmt w:val="lowerRoman"/>
+      <w:lvlText w:val="%3."/>
+      <w:lvlJc w:val="right"/>
+      <w:pPr>
+        <w:ind w:left="2508" w:hanging="180"/>
+      </w:pPr>
+    </w:lvl>
+    <w:lvl w:ilvl="3" w:tplc="0C0C000F" w:tentative="1">
+      <w:start w:val="1"/>
+      <w:numFmt w:val="decimal"/>
+      <w:lvlText w:val="%4."/>
+      <w:lvlJc w:val="left"/>
+      <w:pPr>
+        <w:ind w:left="3228" w:hanging="360"/>
+      </w:pPr>
+    </w:lvl>
+    <w:lvl w:ilvl="4" w:tplc="0C0C0019" w:tentative="1">
+      <w:start w:val="1"/>
+      <w:numFmt w:val="lowerLetter"/>
+      <w:lvlText w:val="%5."/>
+      <w:lvlJc w:val="left"/>
+      <w:pPr>
+        <w:ind w:left="3948" w:hanging="360"/>
+      </w:pPr>
+    </w:lvl>
+    <w:lvl w:ilvl="5" w:tplc="0C0C001B" w:tentative="1">
+      <w:start w:val="1"/>
+      <w:numFmt w:val="lowerRoman"/>
+      <w:lvlText w:val="%6."/>
+      <w:lvlJc w:val="right"/>
+      <w:pPr>
+        <w:ind w:left="4668" w:hanging="180"/>
+      </w:pPr>
+    </w:lvl>
+    <w:lvl w:ilvl="6" w:tplc="0C0C000F" w:tentative="1">
+      <w:start w:val="1"/>
+      <w:numFmt w:val="decimal"/>
+      <w:lvlText w:val="%7."/>
+      <w:lvlJc w:val="left"/>
+      <w:pPr>
+        <w:ind w:left="5388" w:hanging="360"/>
+      </w:pPr>
+    </w:lvl>
+    <w:lvl w:ilvl="7" w:tplc="0C0C0019" w:tentative="1">
+      <w:start w:val="1"/>
+      <w:numFmt w:val="lowerLetter"/>
+      <w:lvlText w:val="%8."/>
+      <w:lvlJc w:val="left"/>
+      <w:pPr>
+        <w:ind w:left="6108" w:hanging="360"/>
+      </w:pPr>
+    </w:lvl>
+    <w:lvl w:ilvl="8" w:tplc="0C0C001B" w:tentative="1">
+      <w:start w:val="1"/>
+      <w:numFmt w:val="lowerRoman"/>
+      <w:lvlText w:val="%9."/>
+      <w:lvlJc w:val="right"/>
+      <w:pPr>
+        <w:ind w:left="6828" w:hanging="180"/>
+      </w:pPr>
+    </w:lvl>
+  </w:abstractNum>
+  <w:abstractNum w:abstractNumId="13" w15:restartNumberingAfterBreak="0">
+    <w:nsid w:val="7AA445C9"/>
+    <w:multiLevelType w:val="hybridMultilevel"/>
+    <w:tmpl w:val="BAA01EB2"/>
+    <w:lvl w:ilvl="0" w:tplc="A2CAC712">
+      <w:numFmt w:val="bullet"/>
+      <w:lvlText w:val="-"/>
+      <w:lvlJc w:val="left"/>
+      <w:pPr>
+        <w:ind w:left="720" w:hanging="360"/>
+      </w:pPr>
+      <w:rPr>
+        <w:rFonts w:ascii="Times New Roman" w:eastAsiaTheme="minorHAnsi" w:hAnsi="Times New Roman" w:cs="Times New Roman" w:hint="default"/>
+      </w:rPr>
+    </w:lvl>
+    <w:lvl w:ilvl="1" w:tplc="0C0C0003" w:tentative="1">
+      <w:start w:val="1"/>
+      <w:numFmt w:val="bullet"/>
+      <w:lvlText w:val="o"/>
+      <w:lvlJc w:val="left"/>
+      <w:pPr>
+        <w:ind w:left="1440" w:hanging="360"/>
+      </w:pPr>
+      <w:rPr>
+        <w:rFonts w:ascii="Courier New" w:hAnsi="Courier New" w:cs="Courier New" w:hint="default"/>
+      </w:rPr>
+    </w:lvl>
+    <w:lvl w:ilvl="2" w:tplc="0C0C0005" w:tentative="1">
+      <w:start w:val="1"/>
+      <w:numFmt w:val="bullet"/>
+      <w:lvlText w:val=""/>
+      <w:lvlJc w:val="left"/>
+      <w:pPr>
+        <w:ind w:left="2160" w:hanging="360"/>
+      </w:pPr>
+      <w:rPr>
+        <w:rFonts w:ascii="Wingdings" w:hAnsi="Wingdings" w:hint="default"/>
+      </w:rPr>
+    </w:lvl>
+    <w:lvl w:ilvl="3" w:tplc="0C0C0001" w:tentative="1">
+      <w:start w:val="1"/>
+      <w:numFmt w:val="bullet"/>
+      <w:lvlText w:val=""/>
+      <w:lvlJc w:val="left"/>
+      <w:pPr>
+        <w:ind w:left="2880" w:hanging="360"/>
+      </w:pPr>
+      <w:rPr>
+        <w:rFonts w:ascii="Symbol" w:hAnsi="Symbol" w:hint="default"/>
+      </w:rPr>
+    </w:lvl>
+    <w:lvl w:ilvl="4" w:tplc="0C0C0003" w:tentative="1">
+      <w:start w:val="1"/>
+      <w:numFmt w:val="bullet"/>
+      <w:lvlText w:val="o"/>
+      <w:lvlJc w:val="left"/>
+      <w:pPr>
+        <w:ind w:left="3600" w:hanging="360"/>
+      </w:pPr>
+      <w:rPr>
+        <w:rFonts w:ascii="Courier New" w:hAnsi="Courier New" w:cs="Courier New" w:hint="default"/>
+      </w:rPr>
+    </w:lvl>
+    <w:lvl w:ilvl="5" w:tplc="0C0C0005" w:tentative="1">
+      <w:start w:val="1"/>
+      <w:numFmt w:val="bullet"/>
+      <w:lvlText w:val=""/>
+      <w:lvlJc w:val="left"/>
+      <w:pPr>
+        <w:ind w:left="4320" w:hanging="360"/>
+      </w:pPr>
+      <w:rPr>
+        <w:rFonts w:ascii="Wingdings" w:hAnsi="Wingdings" w:hint="default"/>
+      </w:rPr>
+    </w:lvl>
+    <w:lvl w:ilvl="6" w:tplc="0C0C0001" w:tentative="1">
+      <w:start w:val="1"/>
+      <w:numFmt w:val="bullet"/>
+      <w:lvlText w:val=""/>
+      <w:lvlJc w:val="left"/>
+      <w:pPr>
+        <w:ind w:left="5040" w:hanging="360"/>
+      </w:pPr>
+      <w:rPr>
+        <w:rFonts w:ascii="Symbol" w:hAnsi="Symbol" w:hint="default"/>
+      </w:rPr>
+    </w:lvl>
+    <w:lvl w:ilvl="7" w:tplc="0C0C0003" w:tentative="1">
+      <w:start w:val="1"/>
+      <w:numFmt w:val="bullet"/>
+      <w:lvlText w:val="o"/>
+      <w:lvlJc w:val="left"/>
+      <w:pPr>
+        <w:ind w:left="5760" w:hanging="360"/>
+      </w:pPr>
+      <w:rPr>
+        <w:rFonts w:ascii="Courier New" w:hAnsi="Courier New" w:cs="Courier New" w:hint="default"/>
+      </w:rPr>
+    </w:lvl>
+    <w:lvl w:ilvl="8" w:tplc="0C0C0005" w:tentative="1">
+      <w:start w:val="1"/>
+      <w:numFmt w:val="bullet"/>
+      <w:lvlText w:val=""/>
+      <w:lvlJc w:val="left"/>
+      <w:pPr>
+        <w:ind w:left="6480" w:hanging="360"/>
+      </w:pPr>
+      <w:rPr>
+        <w:rFonts w:ascii="Wingdings" w:hAnsi="Wingdings" w:hint="default"/>
+      </w:rPr>
+    </w:lvl>
+  </w:abstractNum>
+  <w:num w:numId="1" w16cid:durableId="274750628">
+    <w:abstractNumId w:val="13"/>
+  </w:num>
+  <w:num w:numId="2" w16cid:durableId="136070394">
+    <w:abstractNumId w:val="3"/>
+  </w:num>
+  <w:num w:numId="3" w16cid:durableId="1818648562">
+    <w:abstractNumId w:val="1"/>
+  </w:num>
+  <w:num w:numId="4" w16cid:durableId="593171751">
+    <w:abstractNumId w:val="4"/>
+  </w:num>
+  <w:num w:numId="5" w16cid:durableId="359553749">
+    <w:abstractNumId w:val="6"/>
+  </w:num>
+  <w:num w:numId="6" w16cid:durableId="1877615299">
+    <w:abstractNumId w:val="9"/>
+  </w:num>
+  <w:num w:numId="7" w16cid:durableId="884565781">
+    <w:abstractNumId w:val="8"/>
+  </w:num>
+  <w:num w:numId="8" w16cid:durableId="2059940032">
+    <w:abstractNumId w:val="2"/>
+  </w:num>
+  <w:num w:numId="9" w16cid:durableId="318845445">
+    <w:abstractNumId w:val="5"/>
+  </w:num>
+  <w:num w:numId="10" w16cid:durableId="1482693170">
+    <w:abstractNumId w:val="0"/>
+  </w:num>
+  <w:num w:numId="11" w16cid:durableId="2003119786">
+    <w:abstractNumId w:val="10"/>
+  </w:num>
+  <w:num w:numId="12" w16cid:durableId="1003820463">
+    <w:abstractNumId w:val="7"/>
+  </w:num>
+  <w:num w:numId="13" w16cid:durableId="511408809">
+    <w:abstractNumId w:val="12"/>
+  </w:num>
+  <w:num w:numId="14" w16cid:durableId="863135043">
+    <w:abstractNumId w:val="11"/>
+  </w:num>
+</w:numbering>
 </file>
 
 <file path=word/styles.xml><?xml version="1.0" encoding="utf-8"?>

</xml_diff>

<commit_message>
Contrat d'opération - Itération 1
</commit_message>
<xml_diff>
--- a/res/cas_utilisation.docx
+++ b/res/cas_utilisation.docx
@@ -317,7 +317,18 @@
           <w:szCs w:val="26"/>
           <w:lang w:val="fr-FR"/>
         </w:rPr>
-        <w:t>les clés publiques et privées</w:t>
+        <w:t>les clés publique et privé</w:t>
+      </w:r>
+      <w:r>
+        <w:rPr>
+          <w:rFonts w:ascii="Times New Roman" w:hAnsi="Times New Roman" w:cs="Times New Roman"/>
+          <w:b/>
+          <w:bCs/>
+          <w:sz w:val="26"/>
+          <w:szCs w:val="26"/>
+          <w:lang w:val="fr-FR"/>
+        </w:rPr>
+        <w:t>e</w:t>
       </w:r>
     </w:p>
     <w:p>
@@ -468,7 +479,21 @@
           <w:rFonts w:ascii="Times New Roman" w:hAnsi="Times New Roman" w:cs="Times New Roman"/>
           <w:lang w:val="fr-FR"/>
         </w:rPr>
-        <w:t xml:space="preserve"> publique et privée ont été générés</w:t>
+        <w:t xml:space="preserve"> publique et privée ont été généré</w:t>
+      </w:r>
+      <w:r>
+        <w:rPr>
+          <w:rFonts w:ascii="Times New Roman" w:hAnsi="Times New Roman" w:cs="Times New Roman"/>
+          <w:lang w:val="fr-FR"/>
+        </w:rPr>
+        <w:t>e</w:t>
+      </w:r>
+      <w:r>
+        <w:rPr>
+          <w:rFonts w:ascii="Times New Roman" w:hAnsi="Times New Roman" w:cs="Times New Roman"/>
+          <w:lang w:val="fr-FR"/>
+        </w:rPr>
+        <w:t>s</w:t>
       </w:r>
       <w:r>
         <w:rPr>
@@ -569,23 +594,7 @@
           <w:rFonts w:ascii="Times New Roman" w:hAnsi="Times New Roman" w:cs="Times New Roman"/>
           <w:lang w:val="fr-FR"/>
         </w:rPr>
-        <w:t>a commande « </w:t>
-      </w:r>
-      <w:proofErr w:type="spellStart"/>
-      <w:r>
-        <w:rPr>
-          <w:rFonts w:ascii="Times New Roman" w:hAnsi="Times New Roman" w:cs="Times New Roman"/>
-          <w:lang w:val="fr-FR"/>
-        </w:rPr>
-        <w:t>genkeys</w:t>
-      </w:r>
-      <w:proofErr w:type="spellEnd"/>
-      <w:r>
-        <w:rPr>
-          <w:rFonts w:ascii="Times New Roman" w:hAnsi="Times New Roman" w:cs="Times New Roman"/>
-          <w:lang w:val="fr-FR"/>
-        </w:rPr>
-        <w:t> »</w:t>
+        <w:t>a commande « genkeys »</w:t>
       </w:r>
       <w:r>
         <w:rPr>
@@ -784,7 +793,21 @@
           <w:rFonts w:ascii="Times New Roman" w:hAnsi="Times New Roman" w:cs="Times New Roman"/>
           <w:lang w:val="fr-FR"/>
         </w:rPr>
-        <w:t>Le programme génère les clés privées et publiques</w:t>
+        <w:t>Le programme génère les clés privé</w:t>
+      </w:r>
+      <w:r>
+        <w:rPr>
+          <w:rFonts w:ascii="Times New Roman" w:hAnsi="Times New Roman" w:cs="Times New Roman"/>
+          <w:lang w:val="fr-FR"/>
+        </w:rPr>
+        <w:t>e</w:t>
+      </w:r>
+      <w:r>
+        <w:rPr>
+          <w:rFonts w:ascii="Times New Roman" w:hAnsi="Times New Roman" w:cs="Times New Roman"/>
+          <w:lang w:val="fr-FR"/>
+        </w:rPr>
+        <w:t xml:space="preserve"> et publique</w:t>
       </w:r>
       <w:r>
         <w:rPr>
@@ -1257,23 +1280,7 @@
           <w:rFonts w:ascii="Times New Roman" w:hAnsi="Times New Roman" w:cs="Times New Roman"/>
           <w:lang w:val="fr-FR"/>
         </w:rPr>
-        <w:t>La commande « </w:t>
-      </w:r>
-      <w:proofErr w:type="spellStart"/>
-      <w:r>
-        <w:rPr>
-          <w:rFonts w:ascii="Times New Roman" w:hAnsi="Times New Roman" w:cs="Times New Roman"/>
-          <w:lang w:val="fr-FR"/>
-        </w:rPr>
-        <w:t>encrypt</w:t>
-      </w:r>
-      <w:proofErr w:type="spellEnd"/>
-      <w:r>
-        <w:rPr>
-          <w:rFonts w:ascii="Times New Roman" w:hAnsi="Times New Roman" w:cs="Times New Roman"/>
-          <w:lang w:val="fr-FR"/>
-        </w:rPr>
-        <w:t> »</w:t>
+        <w:t>La commande « encrypt »</w:t>
       </w:r>
       <w:r>
         <w:rPr>
@@ -1555,21 +1562,7 @@
           <w:rFonts w:ascii="Times New Roman" w:hAnsi="Times New Roman" w:cs="Times New Roman"/>
           <w:lang w:val="fr-FR"/>
         </w:rPr>
-        <w:t xml:space="preserve">La clé </w:t>
-      </w:r>
-      <w:r>
-        <w:rPr>
-          <w:rFonts w:ascii="Times New Roman" w:hAnsi="Times New Roman" w:cs="Times New Roman"/>
-          <w:lang w:val="fr-FR"/>
-        </w:rPr>
-        <w:t>privée</w:t>
-      </w:r>
-      <w:r>
-        <w:rPr>
-          <w:rFonts w:ascii="Times New Roman" w:hAnsi="Times New Roman" w:cs="Times New Roman"/>
-          <w:lang w:val="fr-FR"/>
-        </w:rPr>
-        <w:t xml:space="preserve"> est générée.</w:t>
+        <w:t>La clé privée est générée.</w:t>
       </w:r>
     </w:p>
     <w:p>
@@ -1608,21 +1601,7 @@
           <w:rFonts w:ascii="Times New Roman" w:hAnsi="Times New Roman" w:cs="Times New Roman"/>
           <w:lang w:val="fr-FR"/>
         </w:rPr>
-        <w:t xml:space="preserve">Le message a été </w:t>
-      </w:r>
-      <w:r>
-        <w:rPr>
-          <w:rFonts w:ascii="Times New Roman" w:hAnsi="Times New Roman" w:cs="Times New Roman"/>
-          <w:lang w:val="fr-FR"/>
-        </w:rPr>
-        <w:t>dé</w:t>
-      </w:r>
-      <w:r>
-        <w:rPr>
-          <w:rFonts w:ascii="Times New Roman" w:hAnsi="Times New Roman" w:cs="Times New Roman"/>
-          <w:lang w:val="fr-FR"/>
-        </w:rPr>
-        <w:t>crypté.</w:t>
+        <w:t>Le message a été décrypté.</w:t>
       </w:r>
     </w:p>
     <w:p>
@@ -1683,7 +1662,6 @@
         </w:rPr>
         <w:t>La commande « </w:t>
       </w:r>
-      <w:proofErr w:type="spellStart"/>
       <w:r>
         <w:rPr>
           <w:rFonts w:ascii="Times New Roman" w:hAnsi="Times New Roman" w:cs="Times New Roman"/>
@@ -1691,7 +1669,6 @@
         </w:rPr>
         <w:t>decrypt</w:t>
       </w:r>
-      <w:proofErr w:type="spellEnd"/>
       <w:r>
         <w:rPr>
           <w:rFonts w:ascii="Times New Roman" w:hAnsi="Times New Roman" w:cs="Times New Roman"/>
@@ -1859,21 +1836,7 @@
           <w:rFonts w:ascii="Times New Roman" w:hAnsi="Times New Roman" w:cs="Times New Roman"/>
           <w:lang w:val="fr-FR"/>
         </w:rPr>
-        <w:t xml:space="preserve">Démontrer que les chaines de caractères sont </w:t>
-      </w:r>
-      <w:r>
-        <w:rPr>
-          <w:rFonts w:ascii="Times New Roman" w:hAnsi="Times New Roman" w:cs="Times New Roman"/>
-          <w:lang w:val="fr-FR"/>
-        </w:rPr>
-        <w:t>décryptées</w:t>
-      </w:r>
-      <w:r>
-        <w:rPr>
-          <w:rFonts w:ascii="Times New Roman" w:hAnsi="Times New Roman" w:cs="Times New Roman"/>
-          <w:lang w:val="fr-FR"/>
-        </w:rPr>
-        <w:t xml:space="preserve"> correctement.</w:t>
+        <w:t>Démontrer que les chaines de caractères sont décryptées correctement.</w:t>
       </w:r>
     </w:p>
     <w:p>

</xml_diff>